<commit_message>
Project Early Stage Five Phases Progress
</commit_message>
<xml_diff>
--- a/idea/1.docx
+++ b/idea/1.docx
@@ -5609,359 +5609,424 @@
         </w:rPr>
         <w:t>D2：1IC分数规则说明</w:t>
       </w:r>
+      <w:r>
+        <w:rPr>
+          <w:rFonts w:ascii="宋体" w:hAnsi="宋体" w:eastAsia="宋体" w:cs="宋体"/>
+          <w:sz w:val="24"/>
+          <w:szCs w:val="24"/>
+        </w:rPr>
+        <w:t>D2_IC_rules.md</w:t>
+      </w:r>
+      <w:r>
+        <w:rPr>
+          <w:rFonts w:hint="eastAsia" w:ascii="宋体" w:hAnsi="宋体" w:eastAsia="宋体" w:cs="宋体"/>
+          <w:sz w:val="24"/>
+          <w:szCs w:val="24"/>
+          <w:lang w:eastAsia="zh-CN"/>
+        </w:rPr>
+        <w:t>，</w:t>
+      </w:r>
+      <w:r>
+        <w:rPr>
+          <w:rStyle w:val="8"/>
+          <w:rFonts w:ascii="宋体" w:hAnsi="宋体" w:eastAsia="宋体" w:cs="宋体"/>
+          <w:sz w:val="24"/>
+          <w:szCs w:val="24"/>
+        </w:rPr>
+        <w:t>D2_with_IC.csv</w:t>
+      </w:r>
+      <w:r>
+        <w:rPr>
+          <w:rStyle w:val="8"/>
+          <w:rFonts w:hint="eastAsia" w:ascii="宋体" w:hAnsi="宋体" w:eastAsia="宋体" w:cs="宋体"/>
+          <w:sz w:val="24"/>
+          <w:szCs w:val="24"/>
+          <w:lang w:eastAsia="zh-CN"/>
+        </w:rPr>
+        <w:t>（</w:t>
+      </w:r>
+      <w:r>
+        <w:rPr>
+          <w:rStyle w:val="8"/>
+          <w:rFonts w:hint="eastAsia" w:ascii="宋体" w:hAnsi="宋体" w:eastAsia="宋体" w:cs="宋体"/>
+          <w:sz w:val="24"/>
+          <w:szCs w:val="24"/>
+          <w:lang w:val="en-US" w:eastAsia="zh-CN"/>
+        </w:rPr>
+        <w:t>IC详细数据</w:t>
+      </w:r>
+      <w:r>
+        <w:rPr>
+          <w:rStyle w:val="8"/>
+          <w:rFonts w:hint="eastAsia" w:ascii="宋体" w:hAnsi="宋体" w:eastAsia="宋体" w:cs="宋体"/>
+          <w:sz w:val="24"/>
+          <w:szCs w:val="24"/>
+          <w:lang w:eastAsia="zh-CN"/>
+        </w:rPr>
+        <w:t>）</w:t>
+      </w:r>
+    </w:p>
+    <w:p>
+      <w:pPr>
+        <w:widowControl w:val="0"/>
+        <w:numPr>
+          <w:ilvl w:val="0"/>
+          <w:numId w:val="0"/>
+        </w:numPr>
+        <w:jc w:val="both"/>
+        <w:rPr>
+          <w:rFonts w:ascii="宋体" w:hAnsi="宋体" w:eastAsia="宋体" w:cs="宋体"/>
+          <w:sz w:val="24"/>
+          <w:szCs w:val="24"/>
+        </w:rPr>
+      </w:pPr>
+      <w:r>
+        <w:rPr>
+          <w:rStyle w:val="8"/>
+          <w:rFonts w:hint="eastAsia" w:ascii="宋体" w:hAnsi="宋体" w:eastAsia="宋体" w:cs="宋体"/>
+          <w:sz w:val="24"/>
+          <w:szCs w:val="24"/>
+          <w:lang w:val="en-US" w:eastAsia="zh-CN"/>
+        </w:rPr>
+        <w:t>D3：</w:t>
+      </w:r>
+      <w:r>
+        <w:rPr>
+          <w:rStyle w:val="8"/>
+          <w:rFonts w:ascii="宋体" w:hAnsi="宋体" w:eastAsia="宋体" w:cs="宋体"/>
+          <w:sz w:val="24"/>
+          <w:szCs w:val="24"/>
+        </w:rPr>
+        <w:t>D3_embeddings.parquet</w:t>
+      </w:r>
+      <w:r>
+        <w:rPr>
+          <w:rFonts w:ascii="宋体" w:hAnsi="宋体" w:eastAsia="宋体" w:cs="宋体"/>
+          <w:sz w:val="24"/>
+          <w:szCs w:val="24"/>
+        </w:rPr>
+        <w:t>（编号 + embedding向量）</w:t>
+      </w:r>
+      <w:r>
+        <w:rPr>
+          <w:rFonts w:hint="eastAsia" w:ascii="宋体" w:hAnsi="宋体" w:eastAsia="宋体" w:cs="宋体"/>
+          <w:sz w:val="24"/>
+          <w:szCs w:val="24"/>
+          <w:lang w:eastAsia="zh-CN"/>
+        </w:rPr>
+        <w:t>，</w:t>
+      </w:r>
+      <w:r>
+        <w:rPr>
+          <w:rStyle w:val="8"/>
+          <w:rFonts w:ascii="宋体" w:hAnsi="宋体" w:eastAsia="宋体" w:cs="宋体"/>
+          <w:sz w:val="24"/>
+          <w:szCs w:val="24"/>
+        </w:rPr>
+        <w:t>D3_cluster_assignments.csv</w:t>
+      </w:r>
+      <w:r>
+        <w:rPr>
+          <w:rFonts w:ascii="宋体" w:hAnsi="宋体" w:eastAsia="宋体" w:cs="宋体"/>
+          <w:sz w:val="24"/>
+          <w:szCs w:val="24"/>
+        </w:rPr>
+        <w:t>（编号 + cluster_id + IC_total/level）</w:t>
+      </w:r>
+      <w:r>
+        <w:rPr>
+          <w:rFonts w:hint="eastAsia" w:ascii="宋体" w:hAnsi="宋体" w:eastAsia="宋体" w:cs="宋体"/>
+          <w:sz w:val="24"/>
+          <w:szCs w:val="24"/>
+          <w:lang w:eastAsia="zh-CN"/>
+        </w:rPr>
+        <w:t>，</w:t>
+      </w:r>
+      <w:r>
+        <w:rPr>
+          <w:rFonts w:ascii="宋体" w:hAnsi="宋体" w:eastAsia="宋体" w:cs="宋体"/>
+          <w:sz w:val="24"/>
+          <w:szCs w:val="24"/>
+        </w:rPr>
+        <w:t>figures/D3_umap_clusters.png</w:t>
+      </w:r>
+      <w:r>
+        <w:rPr>
+          <w:rFonts w:hint="eastAsia" w:ascii="宋体" w:hAnsi="宋体" w:eastAsia="宋体" w:cs="宋体"/>
+          <w:sz w:val="24"/>
+          <w:szCs w:val="24"/>
+          <w:lang w:eastAsia="zh-CN"/>
+        </w:rPr>
+        <w:t>，</w:t>
+      </w:r>
+      <w:r>
+        <w:rPr>
+          <w:rFonts w:ascii="宋体" w:hAnsi="宋体" w:eastAsia="宋体" w:cs="宋体"/>
+          <w:sz w:val="24"/>
+          <w:szCs w:val="24"/>
+        </w:rPr>
+        <w:t>figures/D3_radar_by_cluster.png</w:t>
+      </w:r>
+      <w:r>
+        <w:rPr>
+          <w:rFonts w:hint="eastAsia" w:ascii="宋体" w:hAnsi="宋体" w:eastAsia="宋体" w:cs="宋体"/>
+          <w:sz w:val="24"/>
+          <w:szCs w:val="24"/>
+          <w:lang w:eastAsia="zh-CN"/>
+        </w:rPr>
+        <w:t>，</w:t>
+      </w:r>
+      <w:r>
+        <w:rPr>
+          <w:rStyle w:val="8"/>
+          <w:rFonts w:ascii="宋体" w:hAnsi="宋体" w:eastAsia="宋体" w:cs="宋体"/>
+          <w:sz w:val="24"/>
+          <w:szCs w:val="24"/>
+        </w:rPr>
+        <w:t>D3_cluster_profiles.xlsx</w:t>
+      </w:r>
+      <w:r>
+        <w:rPr>
+          <w:rFonts w:ascii="宋体" w:hAnsi="宋体" w:eastAsia="宋体" w:cs="宋体"/>
+          <w:sz w:val="24"/>
+          <w:szCs w:val="24"/>
+        </w:rPr>
+        <w:t>（每个 cluster 的统计摘要表）</w:t>
+      </w:r>
+    </w:p>
+    <w:p>
+      <w:pPr>
+        <w:widowControl w:val="0"/>
+        <w:numPr>
+          <w:ilvl w:val="0"/>
+          <w:numId w:val="0"/>
+        </w:numPr>
+        <w:jc w:val="both"/>
+        <w:rPr>
+          <w:rFonts w:ascii="宋体" w:hAnsi="宋体" w:eastAsia="宋体" w:cs="宋体"/>
+          <w:sz w:val="24"/>
+          <w:szCs w:val="24"/>
+        </w:rPr>
+      </w:pPr>
+      <w:r>
+        <w:rPr>
+          <w:rFonts w:hint="eastAsia" w:ascii="宋体" w:hAnsi="宋体" w:eastAsia="宋体" w:cs="宋体"/>
+          <w:sz w:val="24"/>
+          <w:szCs w:val="24"/>
+          <w:lang w:val="en-US" w:eastAsia="zh-CN"/>
+        </w:rPr>
+        <w:t>D4：</w:t>
+      </w:r>
+      <w:r>
+        <w:rPr>
+          <w:rFonts w:ascii="宋体" w:hAnsi="宋体" w:eastAsia="宋体" w:cs="宋体"/>
+          <w:sz w:val="24"/>
+          <w:szCs w:val="24"/>
+        </w:rPr>
+        <w:t>全局重要性排名</w:t>
+      </w:r>
+      <w:r>
+        <w:rPr>
+          <w:rFonts w:hint="eastAsia" w:ascii="宋体" w:hAnsi="宋体" w:eastAsia="宋体" w:cs="宋体"/>
+          <w:sz w:val="24"/>
+          <w:szCs w:val="24"/>
+          <w:lang w:eastAsia="zh-CN"/>
+        </w:rPr>
+        <w:t>，</w:t>
+      </w:r>
+      <w:r>
+        <w:rPr>
+          <w:rFonts w:ascii="宋体" w:hAnsi="宋体" w:eastAsia="宋体" w:cs="宋体"/>
+          <w:sz w:val="24"/>
+          <w:szCs w:val="24"/>
+        </w:rPr>
+        <w:t>每个亚型的“驱动因素”差异（cluster-wise SHAP summary）</w:t>
+      </w:r>
+      <w:r>
+        <w:rPr>
+          <w:rFonts w:hint="eastAsia" w:ascii="宋体" w:hAnsi="宋体" w:eastAsia="宋体" w:cs="宋体"/>
+          <w:sz w:val="24"/>
+          <w:szCs w:val="24"/>
+          <w:lang w:eastAsia="zh-CN"/>
+        </w:rPr>
+        <w:t>，</w:t>
+      </w:r>
+      <w:r>
+        <w:rPr>
+          <w:rFonts w:ascii="宋体" w:hAnsi="宋体" w:eastAsia="宋体" w:cs="宋体"/>
+          <w:sz w:val="24"/>
+          <w:szCs w:val="24"/>
+        </w:rPr>
+        <w:t>方向性解释（dependence plot：变量值越大风险越高/越低）</w:t>
+      </w:r>
+    </w:p>
+    <w:p>
+      <w:pPr>
+        <w:widowControl w:val="0"/>
+        <w:numPr>
+          <w:ilvl w:val="0"/>
+          <w:numId w:val="0"/>
+        </w:numPr>
+        <w:jc w:val="both"/>
+        <w:rPr>
+          <w:rFonts w:hint="eastAsia" w:ascii="宋体" w:hAnsi="宋体" w:eastAsia="宋体" w:cs="宋体"/>
+          <w:sz w:val="24"/>
+          <w:szCs w:val="24"/>
+          <w:lang w:val="en-US" w:eastAsia="zh-CN"/>
+        </w:rPr>
+      </w:pPr>
+      <w:r>
+        <w:rPr>
+          <w:rFonts w:hint="eastAsia" w:ascii="宋体" w:hAnsi="宋体" w:eastAsia="宋体" w:cs="宋体"/>
+          <w:sz w:val="24"/>
+          <w:szCs w:val="24"/>
+          <w:lang w:val="en-US" w:eastAsia="zh-CN"/>
+        </w:rPr>
+        <w:t>具体而言是：</w:t>
+      </w:r>
+      <w:r>
+        <w:rPr>
+          <w:rFonts w:ascii="宋体" w:hAnsi="宋体" w:eastAsia="宋体" w:cs="宋体"/>
+          <w:sz w:val="24"/>
+          <w:szCs w:val="24"/>
+        </w:rPr>
+        <w:t>D4_feature_importance_IC.csv</w:t>
+      </w:r>
+      <w:r>
+        <w:rPr>
+          <w:rFonts w:hint="eastAsia" w:ascii="宋体" w:hAnsi="宋体" w:eastAsia="宋体" w:cs="宋体"/>
+          <w:sz w:val="24"/>
+          <w:szCs w:val="24"/>
+          <w:lang w:eastAsia="zh-CN"/>
+        </w:rPr>
+        <w:t>，</w:t>
+      </w:r>
+      <w:r>
+        <w:rPr>
+          <w:rFonts w:ascii="宋体" w:hAnsi="宋体" w:eastAsia="宋体" w:cs="宋体"/>
+          <w:sz w:val="24"/>
+          <w:szCs w:val="24"/>
+        </w:rPr>
+        <w:t>D4_feature_importance_cluster.csv</w:t>
+      </w:r>
+      <w:r>
+        <w:rPr>
+          <w:rFonts w:hint="eastAsia" w:ascii="宋体" w:hAnsi="宋体" w:eastAsia="宋体" w:cs="宋体"/>
+          <w:sz w:val="24"/>
+          <w:szCs w:val="24"/>
+          <w:lang w:eastAsia="zh-CN"/>
+        </w:rPr>
+        <w:t>，</w:t>
+      </w:r>
+      <w:r>
+        <w:rPr>
+          <w:rFonts w:ascii="宋体" w:hAnsi="宋体" w:eastAsia="宋体" w:cs="宋体"/>
+          <w:sz w:val="24"/>
+          <w:szCs w:val="24"/>
+        </w:rPr>
+        <w:t>figures/D4_shap_summary_IC.png</w:t>
+      </w:r>
+      <w:r>
+        <w:rPr>
+          <w:rFonts w:hint="eastAsia" w:ascii="宋体" w:hAnsi="宋体" w:eastAsia="宋体" w:cs="宋体"/>
+          <w:sz w:val="24"/>
+          <w:szCs w:val="24"/>
+          <w:lang w:eastAsia="zh-CN"/>
+        </w:rPr>
+        <w:t>，</w:t>
+      </w:r>
+      <w:r>
+        <w:rPr>
+          <w:rFonts w:ascii="宋体" w:hAnsi="宋体" w:eastAsia="宋体" w:cs="宋体"/>
+          <w:sz w:val="24"/>
+          <w:szCs w:val="24"/>
+        </w:rPr>
+        <w:t>figures/D4_shap_summary_cluster.png</w:t>
+      </w:r>
+      <w:r>
+        <w:rPr>
+          <w:rFonts w:hint="eastAsia" w:ascii="宋体" w:hAnsi="宋体" w:eastAsia="宋体" w:cs="宋体"/>
+          <w:sz w:val="24"/>
+          <w:szCs w:val="24"/>
+          <w:lang w:eastAsia="zh-CN"/>
+        </w:rPr>
+        <w:t>，</w:t>
+      </w:r>
+      <w:r>
+        <w:rPr>
+          <w:rFonts w:ascii="宋体" w:hAnsi="宋体" w:eastAsia="宋体" w:cs="宋体"/>
+          <w:sz w:val="24"/>
+          <w:szCs w:val="24"/>
+        </w:rPr>
+        <w:t>figures/D4_top_features_bar.png</w:t>
+      </w:r>
+    </w:p>
+    <w:p>
+      <w:pPr>
+        <w:widowControl w:val="0"/>
+        <w:numPr>
+          <w:ilvl w:val="0"/>
+          <w:numId w:val="0"/>
+        </w:numPr>
+        <w:jc w:val="both"/>
+        <w:rPr>
+          <w:rFonts w:hint="eastAsia" w:ascii="宋体" w:hAnsi="宋体" w:eastAsia="宋体" w:cs="宋体"/>
+          <w:sz w:val="24"/>
+          <w:szCs w:val="24"/>
+          <w:lang w:val="en-US" w:eastAsia="zh-CN"/>
+        </w:rPr>
+      </w:pPr>
+    </w:p>
+    <w:p>
+      <w:pPr>
+        <w:widowControl w:val="0"/>
+        <w:numPr>
+          <w:ilvl w:val="0"/>
+          <w:numId w:val="0"/>
+        </w:numPr>
+        <w:jc w:val="both"/>
+        <w:rPr>
+          <w:rFonts w:hint="eastAsia" w:ascii="宋体" w:hAnsi="宋体" w:eastAsia="宋体" w:cs="宋体"/>
+          <w:sz w:val="24"/>
+          <w:szCs w:val="24"/>
+          <w:lang w:val="en-US" w:eastAsia="zh-CN"/>
+        </w:rPr>
+      </w:pPr>
+      <w:r>
+        <w:rPr>
+          <w:rFonts w:hint="eastAsia" w:ascii="宋体" w:hAnsi="宋体" w:eastAsia="宋体" w:cs="宋体"/>
+          <w:sz w:val="24"/>
+          <w:szCs w:val="24"/>
+          <w:lang w:val="en-US" w:eastAsia="zh-CN"/>
+        </w:rPr>
+        <w:t>2.24这个阶段我们到底在干什么：</w:t>
+      </w:r>
+    </w:p>
+    <w:p>
+      <w:pPr>
+        <w:widowControl w:val="0"/>
+        <w:numPr>
+          <w:ilvl w:val="0"/>
+          <w:numId w:val="0"/>
+        </w:numPr>
+        <w:jc w:val="both"/>
+        <w:rPr>
+          <w:rFonts w:hint="default" w:ascii="宋体" w:hAnsi="宋体" w:eastAsia="宋体" w:cs="宋体"/>
+          <w:sz w:val="24"/>
+          <w:szCs w:val="24"/>
+          <w:lang w:val="en-US" w:eastAsia="zh-CN"/>
+        </w:rPr>
+      </w:pPr>
+      <w:r>
+        <w:rPr>
+          <w:rFonts w:ascii="宋体" w:hAnsi="宋体" w:eastAsia="宋体" w:cs="宋体"/>
+          <w:sz w:val="24"/>
+          <w:szCs w:val="24"/>
+        </w:rPr>
+        <w:t>我们用这 6025×361 的横断面数据先做 D1 数据体检与口径统一；然后按 ICOPE 五域构造一个可解释的 IC 近似总分与分层（D2）；再用表格自监督/Transformer 学 embedding，做无监督聚类分型并输出每型雷达图与特征表（D3）；最后用可解释模型做 IC 与亚型的关键因素排名和解释图（D4）。这条线完全不依赖随访/RCT，也对齐方案强调的无监督分型与评估体系建设。”</w:t>
+      </w:r>
       <w:bookmarkStart w:id="0" w:name="_GoBack"/>
       <w:bookmarkEnd w:id="0"/>
-      <w:r>
-        <w:rPr>
-          <w:rFonts w:ascii="宋体" w:hAnsi="宋体" w:eastAsia="宋体" w:cs="宋体"/>
-          <w:sz w:val="24"/>
-          <w:szCs w:val="24"/>
-        </w:rPr>
-        <w:t>D2_IC_rules.md</w:t>
-      </w:r>
-      <w:r>
-        <w:rPr>
-          <w:rFonts w:hint="eastAsia" w:ascii="宋体" w:hAnsi="宋体" w:eastAsia="宋体" w:cs="宋体"/>
-          <w:sz w:val="24"/>
-          <w:szCs w:val="24"/>
-          <w:lang w:eastAsia="zh-CN"/>
-        </w:rPr>
-        <w:t>，</w:t>
-      </w:r>
-      <w:r>
-        <w:rPr>
-          <w:rStyle w:val="8"/>
-          <w:rFonts w:ascii="宋体" w:hAnsi="宋体" w:eastAsia="宋体" w:cs="宋体"/>
-          <w:sz w:val="24"/>
-          <w:szCs w:val="24"/>
-        </w:rPr>
-        <w:t>D2_with_IC.csv</w:t>
-      </w:r>
-      <w:r>
-        <w:rPr>
-          <w:rStyle w:val="8"/>
-          <w:rFonts w:hint="eastAsia" w:ascii="宋体" w:hAnsi="宋体" w:eastAsia="宋体" w:cs="宋体"/>
-          <w:sz w:val="24"/>
-          <w:szCs w:val="24"/>
-          <w:lang w:eastAsia="zh-CN"/>
-        </w:rPr>
-        <w:t>（</w:t>
-      </w:r>
-      <w:r>
-        <w:rPr>
-          <w:rStyle w:val="8"/>
-          <w:rFonts w:hint="eastAsia" w:ascii="宋体" w:hAnsi="宋体" w:eastAsia="宋体" w:cs="宋体"/>
-          <w:sz w:val="24"/>
-          <w:szCs w:val="24"/>
-          <w:lang w:val="en-US" w:eastAsia="zh-CN"/>
-        </w:rPr>
-        <w:t>IC详细数据</w:t>
-      </w:r>
-      <w:r>
-        <w:rPr>
-          <w:rStyle w:val="8"/>
-          <w:rFonts w:hint="eastAsia" w:ascii="宋体" w:hAnsi="宋体" w:eastAsia="宋体" w:cs="宋体"/>
-          <w:sz w:val="24"/>
-          <w:szCs w:val="24"/>
-          <w:lang w:eastAsia="zh-CN"/>
-        </w:rPr>
-        <w:t>）</w:t>
-      </w:r>
-    </w:p>
-    <w:p>
-      <w:pPr>
-        <w:widowControl w:val="0"/>
-        <w:numPr>
-          <w:ilvl w:val="0"/>
-          <w:numId w:val="0"/>
-        </w:numPr>
-        <w:jc w:val="both"/>
-        <w:rPr>
-          <w:rFonts w:ascii="宋体" w:hAnsi="宋体" w:eastAsia="宋体" w:cs="宋体"/>
-          <w:sz w:val="24"/>
-          <w:szCs w:val="24"/>
-        </w:rPr>
-      </w:pPr>
-      <w:r>
-        <w:rPr>
-          <w:rStyle w:val="8"/>
-          <w:rFonts w:hint="eastAsia" w:ascii="宋体" w:hAnsi="宋体" w:eastAsia="宋体" w:cs="宋体"/>
-          <w:sz w:val="24"/>
-          <w:szCs w:val="24"/>
-          <w:lang w:val="en-US" w:eastAsia="zh-CN"/>
-        </w:rPr>
-        <w:t>D3：</w:t>
-      </w:r>
-      <w:r>
-        <w:rPr>
-          <w:rStyle w:val="8"/>
-          <w:rFonts w:ascii="宋体" w:hAnsi="宋体" w:eastAsia="宋体" w:cs="宋体"/>
-          <w:sz w:val="24"/>
-          <w:szCs w:val="24"/>
-        </w:rPr>
-        <w:t>D3_embeddings.parquet</w:t>
-      </w:r>
-      <w:r>
-        <w:rPr>
-          <w:rFonts w:ascii="宋体" w:hAnsi="宋体" w:eastAsia="宋体" w:cs="宋体"/>
-          <w:sz w:val="24"/>
-          <w:szCs w:val="24"/>
-        </w:rPr>
-        <w:t>（编号 + embedding向量）</w:t>
-      </w:r>
-      <w:r>
-        <w:rPr>
-          <w:rFonts w:hint="eastAsia" w:ascii="宋体" w:hAnsi="宋体" w:eastAsia="宋体" w:cs="宋体"/>
-          <w:sz w:val="24"/>
-          <w:szCs w:val="24"/>
-          <w:lang w:eastAsia="zh-CN"/>
-        </w:rPr>
-        <w:t>，</w:t>
-      </w:r>
-      <w:r>
-        <w:rPr>
-          <w:rStyle w:val="8"/>
-          <w:rFonts w:ascii="宋体" w:hAnsi="宋体" w:eastAsia="宋体" w:cs="宋体"/>
-          <w:sz w:val="24"/>
-          <w:szCs w:val="24"/>
-        </w:rPr>
-        <w:t>D3_cluster_assignments.csv</w:t>
-      </w:r>
-      <w:r>
-        <w:rPr>
-          <w:rFonts w:ascii="宋体" w:hAnsi="宋体" w:eastAsia="宋体" w:cs="宋体"/>
-          <w:sz w:val="24"/>
-          <w:szCs w:val="24"/>
-        </w:rPr>
-        <w:t>（编号 + cluster_id + IC_total/level）</w:t>
-      </w:r>
-      <w:r>
-        <w:rPr>
-          <w:rFonts w:hint="eastAsia" w:ascii="宋体" w:hAnsi="宋体" w:eastAsia="宋体" w:cs="宋体"/>
-          <w:sz w:val="24"/>
-          <w:szCs w:val="24"/>
-          <w:lang w:eastAsia="zh-CN"/>
-        </w:rPr>
-        <w:t>，</w:t>
-      </w:r>
-      <w:r>
-        <w:rPr>
-          <w:rFonts w:ascii="宋体" w:hAnsi="宋体" w:eastAsia="宋体" w:cs="宋体"/>
-          <w:sz w:val="24"/>
-          <w:szCs w:val="24"/>
-        </w:rPr>
-        <w:t>figures/D3_umap_clusters.png</w:t>
-      </w:r>
-      <w:r>
-        <w:rPr>
-          <w:rFonts w:hint="eastAsia" w:ascii="宋体" w:hAnsi="宋体" w:eastAsia="宋体" w:cs="宋体"/>
-          <w:sz w:val="24"/>
-          <w:szCs w:val="24"/>
-          <w:lang w:eastAsia="zh-CN"/>
-        </w:rPr>
-        <w:t>，</w:t>
-      </w:r>
-      <w:r>
-        <w:rPr>
-          <w:rFonts w:ascii="宋体" w:hAnsi="宋体" w:eastAsia="宋体" w:cs="宋体"/>
-          <w:sz w:val="24"/>
-          <w:szCs w:val="24"/>
-        </w:rPr>
-        <w:t>figures/D3_radar_by_cluster.png</w:t>
-      </w:r>
-      <w:r>
-        <w:rPr>
-          <w:rFonts w:hint="eastAsia" w:ascii="宋体" w:hAnsi="宋体" w:eastAsia="宋体" w:cs="宋体"/>
-          <w:sz w:val="24"/>
-          <w:szCs w:val="24"/>
-          <w:lang w:eastAsia="zh-CN"/>
-        </w:rPr>
-        <w:t>，</w:t>
-      </w:r>
-      <w:r>
-        <w:rPr>
-          <w:rStyle w:val="8"/>
-          <w:rFonts w:ascii="宋体" w:hAnsi="宋体" w:eastAsia="宋体" w:cs="宋体"/>
-          <w:sz w:val="24"/>
-          <w:szCs w:val="24"/>
-        </w:rPr>
-        <w:t>D3_cluster_profiles.xlsx</w:t>
-      </w:r>
-      <w:r>
-        <w:rPr>
-          <w:rFonts w:ascii="宋体" w:hAnsi="宋体" w:eastAsia="宋体" w:cs="宋体"/>
-          <w:sz w:val="24"/>
-          <w:szCs w:val="24"/>
-        </w:rPr>
-        <w:t>（每个 cluster 的统计摘要表）</w:t>
-      </w:r>
-    </w:p>
-    <w:p>
-      <w:pPr>
-        <w:widowControl w:val="0"/>
-        <w:numPr>
-          <w:ilvl w:val="0"/>
-          <w:numId w:val="0"/>
-        </w:numPr>
-        <w:jc w:val="both"/>
-        <w:rPr>
-          <w:rFonts w:ascii="宋体" w:hAnsi="宋体" w:eastAsia="宋体" w:cs="宋体"/>
-          <w:sz w:val="24"/>
-          <w:szCs w:val="24"/>
-        </w:rPr>
-      </w:pPr>
-      <w:r>
-        <w:rPr>
-          <w:rFonts w:hint="eastAsia" w:ascii="宋体" w:hAnsi="宋体" w:eastAsia="宋体" w:cs="宋体"/>
-          <w:sz w:val="24"/>
-          <w:szCs w:val="24"/>
-          <w:lang w:val="en-US" w:eastAsia="zh-CN"/>
-        </w:rPr>
-        <w:t>D4：</w:t>
-      </w:r>
-      <w:r>
-        <w:rPr>
-          <w:rFonts w:ascii="宋体" w:hAnsi="宋体" w:eastAsia="宋体" w:cs="宋体"/>
-          <w:sz w:val="24"/>
-          <w:szCs w:val="24"/>
-        </w:rPr>
-        <w:t>全局重要性排名</w:t>
-      </w:r>
-      <w:r>
-        <w:rPr>
-          <w:rFonts w:hint="eastAsia" w:ascii="宋体" w:hAnsi="宋体" w:eastAsia="宋体" w:cs="宋体"/>
-          <w:sz w:val="24"/>
-          <w:szCs w:val="24"/>
-          <w:lang w:eastAsia="zh-CN"/>
-        </w:rPr>
-        <w:t>，</w:t>
-      </w:r>
-      <w:r>
-        <w:rPr>
-          <w:rFonts w:ascii="宋体" w:hAnsi="宋体" w:eastAsia="宋体" w:cs="宋体"/>
-          <w:sz w:val="24"/>
-          <w:szCs w:val="24"/>
-        </w:rPr>
-        <w:t>每个亚型的“驱动因素”差异（cluster-wise SHAP summary）</w:t>
-      </w:r>
-      <w:r>
-        <w:rPr>
-          <w:rFonts w:hint="eastAsia" w:ascii="宋体" w:hAnsi="宋体" w:eastAsia="宋体" w:cs="宋体"/>
-          <w:sz w:val="24"/>
-          <w:szCs w:val="24"/>
-          <w:lang w:eastAsia="zh-CN"/>
-        </w:rPr>
-        <w:t>，</w:t>
-      </w:r>
-      <w:r>
-        <w:rPr>
-          <w:rFonts w:ascii="宋体" w:hAnsi="宋体" w:eastAsia="宋体" w:cs="宋体"/>
-          <w:sz w:val="24"/>
-          <w:szCs w:val="24"/>
-        </w:rPr>
-        <w:t>方向性解释（dependence plot：变量值越大风险越高/越低）</w:t>
-      </w:r>
-    </w:p>
-    <w:p>
-      <w:pPr>
-        <w:widowControl w:val="0"/>
-        <w:numPr>
-          <w:ilvl w:val="0"/>
-          <w:numId w:val="0"/>
-        </w:numPr>
-        <w:jc w:val="both"/>
-        <w:rPr>
-          <w:rFonts w:hint="eastAsia" w:ascii="宋体" w:hAnsi="宋体" w:eastAsia="宋体" w:cs="宋体"/>
-          <w:sz w:val="24"/>
-          <w:szCs w:val="24"/>
-          <w:lang w:val="en-US" w:eastAsia="zh-CN"/>
-        </w:rPr>
-      </w:pPr>
-      <w:r>
-        <w:rPr>
-          <w:rFonts w:hint="eastAsia" w:ascii="宋体" w:hAnsi="宋体" w:eastAsia="宋体" w:cs="宋体"/>
-          <w:sz w:val="24"/>
-          <w:szCs w:val="24"/>
-          <w:lang w:val="en-US" w:eastAsia="zh-CN"/>
-        </w:rPr>
-        <w:t>具体而言是：</w:t>
-      </w:r>
-      <w:r>
-        <w:rPr>
-          <w:rFonts w:ascii="宋体" w:hAnsi="宋体" w:eastAsia="宋体" w:cs="宋体"/>
-          <w:sz w:val="24"/>
-          <w:szCs w:val="24"/>
-        </w:rPr>
-        <w:t>D4_feature_importance_IC.csv</w:t>
-      </w:r>
-      <w:r>
-        <w:rPr>
-          <w:rFonts w:hint="eastAsia" w:ascii="宋体" w:hAnsi="宋体" w:eastAsia="宋体" w:cs="宋体"/>
-          <w:sz w:val="24"/>
-          <w:szCs w:val="24"/>
-          <w:lang w:eastAsia="zh-CN"/>
-        </w:rPr>
-        <w:t>，</w:t>
-      </w:r>
-      <w:r>
-        <w:rPr>
-          <w:rFonts w:ascii="宋体" w:hAnsi="宋体" w:eastAsia="宋体" w:cs="宋体"/>
-          <w:sz w:val="24"/>
-          <w:szCs w:val="24"/>
-        </w:rPr>
-        <w:t>D4_feature_importance_cluster.csv</w:t>
-      </w:r>
-      <w:r>
-        <w:rPr>
-          <w:rFonts w:hint="eastAsia" w:ascii="宋体" w:hAnsi="宋体" w:eastAsia="宋体" w:cs="宋体"/>
-          <w:sz w:val="24"/>
-          <w:szCs w:val="24"/>
-          <w:lang w:eastAsia="zh-CN"/>
-        </w:rPr>
-        <w:t>，</w:t>
-      </w:r>
-      <w:r>
-        <w:rPr>
-          <w:rFonts w:ascii="宋体" w:hAnsi="宋体" w:eastAsia="宋体" w:cs="宋体"/>
-          <w:sz w:val="24"/>
-          <w:szCs w:val="24"/>
-        </w:rPr>
-        <w:t>figures/D4_shap_summary_IC.png</w:t>
-      </w:r>
-      <w:r>
-        <w:rPr>
-          <w:rFonts w:hint="eastAsia" w:ascii="宋体" w:hAnsi="宋体" w:eastAsia="宋体" w:cs="宋体"/>
-          <w:sz w:val="24"/>
-          <w:szCs w:val="24"/>
-          <w:lang w:eastAsia="zh-CN"/>
-        </w:rPr>
-        <w:t>，</w:t>
-      </w:r>
-      <w:r>
-        <w:rPr>
-          <w:rFonts w:ascii="宋体" w:hAnsi="宋体" w:eastAsia="宋体" w:cs="宋体"/>
-          <w:sz w:val="24"/>
-          <w:szCs w:val="24"/>
-        </w:rPr>
-        <w:t>figures/D4_shap_summary_cluster.png</w:t>
-      </w:r>
-      <w:r>
-        <w:rPr>
-          <w:rFonts w:hint="eastAsia" w:ascii="宋体" w:hAnsi="宋体" w:eastAsia="宋体" w:cs="宋体"/>
-          <w:sz w:val="24"/>
-          <w:szCs w:val="24"/>
-          <w:lang w:eastAsia="zh-CN"/>
-        </w:rPr>
-        <w:t>，</w:t>
-      </w:r>
-      <w:r>
-        <w:rPr>
-          <w:rFonts w:ascii="宋体" w:hAnsi="宋体" w:eastAsia="宋体" w:cs="宋体"/>
-          <w:sz w:val="24"/>
-          <w:szCs w:val="24"/>
-        </w:rPr>
-        <w:t>figures/D4_top_features_bar.png</w:t>
-      </w:r>
     </w:p>
     <w:p>
       <w:pPr>

</xml_diff>

<commit_message>
Think for new ideas
</commit_message>
<xml_diff>
--- a/idea/1.docx
+++ b/idea/1.docx
@@ -6099,13 +6099,2322 @@
         <w:ind w:leftChars="0"/>
         <w:jc w:val="both"/>
         <w:rPr>
+          <w:rFonts w:hint="eastAsia"/>
+          <w:sz w:val="28"/>
+          <w:szCs w:val="28"/>
+          <w:lang w:val="en-US" w:eastAsia="zh-CN"/>
+        </w:rPr>
+      </w:pPr>
+      <w:r>
+        <w:rPr>
+          <w:rFonts w:hint="eastAsia"/>
+          <w:sz w:val="28"/>
+          <w:szCs w:val="28"/>
+          <w:lang w:val="en-US" w:eastAsia="zh-CN"/>
+        </w:rPr>
+        <w:t>两个方案：</w:t>
+      </w:r>
+    </w:p>
+    <w:p>
+      <w:pPr>
+        <w:widowControl w:val="0"/>
+        <w:numPr>
+          <w:ilvl w:val="0"/>
+          <w:numId w:val="14"/>
+        </w:numPr>
+        <w:ind w:leftChars="0"/>
+        <w:jc w:val="both"/>
+        <w:rPr>
+          <w:rFonts w:hint="eastAsia"/>
+          <w:sz w:val="28"/>
+          <w:szCs w:val="28"/>
+          <w:lang w:val="en-US" w:eastAsia="zh-CN"/>
+        </w:rPr>
+      </w:pPr>
+      <w:r>
+        <w:rPr>
+          <w:rFonts w:hint="eastAsia"/>
+          <w:sz w:val="28"/>
+          <w:szCs w:val="28"/>
+          <w:lang w:val="en-US" w:eastAsia="zh-CN"/>
+        </w:rPr>
+        <w:t>自监督学习再做无监督分型</w:t>
+      </w:r>
+    </w:p>
+    <w:p>
+      <w:pPr>
+        <w:widowControl w:val="0"/>
+        <w:numPr>
+          <w:ilvl w:val="0"/>
+          <w:numId w:val="14"/>
+        </w:numPr>
+        <w:ind w:leftChars="0"/>
+        <w:jc w:val="both"/>
+        <w:rPr>
           <w:rFonts w:hint="default"/>
           <w:lang w:val="en-US" w:eastAsia="zh-CN"/>
         </w:rPr>
       </w:pPr>
+      <w:r>
+        <w:rPr>
+          <w:rFonts w:hint="eastAsia"/>
+          <w:sz w:val="28"/>
+          <w:szCs w:val="28"/>
+          <w:lang w:val="en-US" w:eastAsia="zh-CN"/>
+        </w:rPr>
+        <w:t>表格转化为文本，再把表格和文本视图在embedding上对齐，这是跨模态的方案</w:t>
+      </w:r>
+      <w:r>
+        <w:rPr>
+          <w:rFonts w:hint="eastAsia"/>
+          <w:lang w:val="en-US" w:eastAsia="zh-CN"/>
+        </w:rPr>
+        <w:br w:type="textWrapping"/>
+      </w:r>
+      <w:r>
+        <w:rPr>
+          <w:rFonts w:hint="eastAsia"/>
+          <w:lang w:val="en-US" w:eastAsia="zh-CN"/>
+        </w:rPr>
+        <w:br w:type="textWrapping"/>
+      </w:r>
+      <w:r>
+        <w:rPr>
+          <w:rFonts w:hint="eastAsia"/>
+          <w:b/>
+          <w:bCs/>
+          <w:lang w:val="en-US" w:eastAsia="zh-CN"/>
+        </w:rPr>
+        <w:t>主推1：这个其实我们第一阶段就已经做出来了，但是做的还是不够系统</w:t>
+      </w:r>
+    </w:p>
+    <w:p>
+      <w:pPr>
+        <w:widowControl w:val="0"/>
+        <w:numPr>
+          <w:numId w:val="0"/>
+        </w:numPr>
+        <w:jc w:val="both"/>
+        <w:rPr>
+          <w:rFonts w:hint="eastAsia"/>
+          <w:b/>
+          <w:bCs/>
+          <w:lang w:val="en-US" w:eastAsia="zh-CN"/>
+        </w:rPr>
+      </w:pPr>
+    </w:p>
+    <w:p>
+      <w:pPr>
+        <w:widowControl w:val="0"/>
+        <w:numPr>
+          <w:numId w:val="0"/>
+        </w:numPr>
+        <w:jc w:val="both"/>
+        <w:rPr>
+          <w:rFonts w:hint="eastAsia"/>
+          <w:b w:val="0"/>
+          <w:bCs w:val="0"/>
+          <w:lang w:val="en-US" w:eastAsia="zh-CN"/>
+        </w:rPr>
+      </w:pPr>
+      <w:r>
+        <w:rPr>
+          <w:rFonts w:hint="eastAsia"/>
+          <w:b w:val="0"/>
+          <w:bCs w:val="0"/>
+          <w:lang w:val="en-US" w:eastAsia="zh-CN"/>
+        </w:rPr>
+        <w:t>初步的实验：</w:t>
+      </w:r>
+    </w:p>
+    <w:p>
+      <w:pPr>
+        <w:widowControl w:val="0"/>
+        <w:numPr>
+          <w:numId w:val="0"/>
+        </w:numPr>
+        <w:jc w:val="both"/>
+        <w:rPr>
+          <w:rFonts w:hint="eastAsia"/>
+          <w:b w:val="0"/>
+          <w:bCs w:val="0"/>
+          <w:lang w:val="en-US" w:eastAsia="zh-CN"/>
+        </w:rPr>
+      </w:pPr>
+      <w:r>
+        <w:rPr>
+          <w:rFonts w:hint="eastAsia"/>
+          <w:b w:val="0"/>
+          <w:bCs w:val="0"/>
+          <w:lang w:val="en-US" w:eastAsia="zh-CN"/>
+        </w:rPr>
+        <w:t>做baseline：PCA，最朴素但是目前来看最强。PCA的效果比目前这个MLP效果好</w:t>
+      </w:r>
+    </w:p>
+    <w:p>
+      <w:pPr>
+        <w:widowControl w:val="0"/>
+        <w:numPr>
+          <w:numId w:val="0"/>
+        </w:numPr>
+        <w:jc w:val="both"/>
+        <w:rPr>
+          <w:rFonts w:hint="default"/>
+          <w:b w:val="0"/>
+          <w:bCs w:val="0"/>
+          <w:lang w:val="en-US" w:eastAsia="zh-CN"/>
+        </w:rPr>
+      </w:pPr>
+      <w:r>
+        <w:rPr>
+          <w:rFonts w:hint="eastAsia"/>
+          <w:b w:val="0"/>
+          <w:bCs w:val="0"/>
+          <w:lang w:val="en-US" w:eastAsia="zh-CN"/>
+        </w:rPr>
+        <w:t>下面是encode的类代码，latent_dim=32掩码重建，训练出来loss能降，但是聚类不稳、不清晰、和IC的依赖关系也不明确不好解释，目前这个轻量版的MLP做的提取器效果没有PCA效果好</w:t>
+      </w:r>
+    </w:p>
+    <w:p>
+      <w:pPr>
+        <w:keepNext w:val="0"/>
+        <w:keepLines w:val="0"/>
+        <w:widowControl/>
+        <w:suppressLineNumbers w:val="0"/>
+        <w:shd w:val="clear" w:fill="1F1F1F"/>
+        <w:spacing w:line="143" w:lineRule="atLeast"/>
+        <w:jc w:val="left"/>
+        <w:rPr>
+          <w:rFonts w:ascii="Consolas" w:hAnsi="Consolas" w:eastAsia="Consolas" w:cs="Consolas"/>
+          <w:b w:val="0"/>
+          <w:bCs w:val="0"/>
+          <w:color w:val="CCCCCC"/>
+          <w:sz w:val="21"/>
+          <w:szCs w:val="21"/>
+        </w:rPr>
+      </w:pPr>
+      <w:r>
+        <w:rPr>
+          <w:rFonts w:hint="default" w:ascii="Consolas" w:hAnsi="Consolas" w:eastAsia="Consolas" w:cs="Consolas"/>
+          <w:b w:val="0"/>
+          <w:bCs w:val="0"/>
+          <w:color w:val="CCCCCC"/>
+          <w:kern w:val="0"/>
+          <w:sz w:val="21"/>
+          <w:szCs w:val="21"/>
+          <w:shd w:val="clear" w:fill="1F1F1F"/>
+          <w:lang w:val="en-US" w:eastAsia="zh-CN" w:bidi="ar"/>
+        </w:rPr>
+        <w:t xml:space="preserve">        </w:t>
+      </w:r>
+      <w:r>
+        <w:rPr>
+          <w:rFonts w:hint="default" w:ascii="Consolas" w:hAnsi="Consolas" w:eastAsia="Consolas" w:cs="Consolas"/>
+          <w:b w:val="0"/>
+          <w:bCs w:val="0"/>
+          <w:color w:val="9CDCFE"/>
+          <w:kern w:val="0"/>
+          <w:sz w:val="21"/>
+          <w:szCs w:val="21"/>
+          <w:shd w:val="clear" w:fill="1F1F1F"/>
+          <w:lang w:val="en-US" w:eastAsia="zh-CN" w:bidi="ar"/>
+        </w:rPr>
+        <w:t>self</w:t>
+      </w:r>
+      <w:r>
+        <w:rPr>
+          <w:rFonts w:hint="default" w:ascii="Consolas" w:hAnsi="Consolas" w:eastAsia="Consolas" w:cs="Consolas"/>
+          <w:b w:val="0"/>
+          <w:bCs w:val="0"/>
+          <w:color w:val="CCCCCC"/>
+          <w:kern w:val="0"/>
+          <w:sz w:val="21"/>
+          <w:szCs w:val="21"/>
+          <w:shd w:val="clear" w:fill="1F1F1F"/>
+          <w:lang w:val="en-US" w:eastAsia="zh-CN" w:bidi="ar"/>
+        </w:rPr>
+        <w:t>.</w:t>
+      </w:r>
+      <w:r>
+        <w:rPr>
+          <w:rFonts w:hint="default" w:ascii="Consolas" w:hAnsi="Consolas" w:eastAsia="Consolas" w:cs="Consolas"/>
+          <w:b w:val="0"/>
+          <w:bCs w:val="0"/>
+          <w:color w:val="9CDCFE"/>
+          <w:kern w:val="0"/>
+          <w:sz w:val="21"/>
+          <w:szCs w:val="21"/>
+          <w:shd w:val="clear" w:fill="1F1F1F"/>
+          <w:lang w:val="en-US" w:eastAsia="zh-CN" w:bidi="ar"/>
+        </w:rPr>
+        <w:t>encoder</w:t>
+      </w:r>
+      <w:r>
+        <w:rPr>
+          <w:rFonts w:hint="default" w:ascii="Consolas" w:hAnsi="Consolas" w:eastAsia="Consolas" w:cs="Consolas"/>
+          <w:b w:val="0"/>
+          <w:bCs w:val="0"/>
+          <w:color w:val="CCCCCC"/>
+          <w:kern w:val="0"/>
+          <w:sz w:val="21"/>
+          <w:szCs w:val="21"/>
+          <w:shd w:val="clear" w:fill="1F1F1F"/>
+          <w:lang w:val="en-US" w:eastAsia="zh-CN" w:bidi="ar"/>
+        </w:rPr>
+        <w:t xml:space="preserve"> </w:t>
+      </w:r>
+      <w:r>
+        <w:rPr>
+          <w:rFonts w:hint="default" w:ascii="Consolas" w:hAnsi="Consolas" w:eastAsia="Consolas" w:cs="Consolas"/>
+          <w:b w:val="0"/>
+          <w:bCs w:val="0"/>
+          <w:color w:val="D4D4D4"/>
+          <w:kern w:val="0"/>
+          <w:sz w:val="21"/>
+          <w:szCs w:val="21"/>
+          <w:shd w:val="clear" w:fill="1F1F1F"/>
+          <w:lang w:val="en-US" w:eastAsia="zh-CN" w:bidi="ar"/>
+        </w:rPr>
+        <w:t>=</w:t>
+      </w:r>
+      <w:r>
+        <w:rPr>
+          <w:rFonts w:hint="default" w:ascii="Consolas" w:hAnsi="Consolas" w:eastAsia="Consolas" w:cs="Consolas"/>
+          <w:b w:val="0"/>
+          <w:bCs w:val="0"/>
+          <w:color w:val="CCCCCC"/>
+          <w:kern w:val="0"/>
+          <w:sz w:val="21"/>
+          <w:szCs w:val="21"/>
+          <w:shd w:val="clear" w:fill="1F1F1F"/>
+          <w:lang w:val="en-US" w:eastAsia="zh-CN" w:bidi="ar"/>
+        </w:rPr>
+        <w:t xml:space="preserve"> </w:t>
+      </w:r>
+      <w:r>
+        <w:rPr>
+          <w:rFonts w:hint="default" w:ascii="Consolas" w:hAnsi="Consolas" w:eastAsia="Consolas" w:cs="Consolas"/>
+          <w:b w:val="0"/>
+          <w:bCs w:val="0"/>
+          <w:color w:val="4EC9B0"/>
+          <w:kern w:val="0"/>
+          <w:sz w:val="21"/>
+          <w:szCs w:val="21"/>
+          <w:shd w:val="clear" w:fill="1F1F1F"/>
+          <w:lang w:val="en-US" w:eastAsia="zh-CN" w:bidi="ar"/>
+        </w:rPr>
+        <w:t>nn</w:t>
+      </w:r>
+      <w:r>
+        <w:rPr>
+          <w:rFonts w:hint="default" w:ascii="Consolas" w:hAnsi="Consolas" w:eastAsia="Consolas" w:cs="Consolas"/>
+          <w:b w:val="0"/>
+          <w:bCs w:val="0"/>
+          <w:color w:val="CCCCCC"/>
+          <w:kern w:val="0"/>
+          <w:sz w:val="21"/>
+          <w:szCs w:val="21"/>
+          <w:shd w:val="clear" w:fill="1F1F1F"/>
+          <w:lang w:val="en-US" w:eastAsia="zh-CN" w:bidi="ar"/>
+        </w:rPr>
+        <w:t>.</w:t>
+      </w:r>
+      <w:r>
+        <w:rPr>
+          <w:rFonts w:hint="default" w:ascii="Consolas" w:hAnsi="Consolas" w:eastAsia="Consolas" w:cs="Consolas"/>
+          <w:b w:val="0"/>
+          <w:bCs w:val="0"/>
+          <w:color w:val="4EC9B0"/>
+          <w:kern w:val="0"/>
+          <w:sz w:val="21"/>
+          <w:szCs w:val="21"/>
+          <w:shd w:val="clear" w:fill="1F1F1F"/>
+          <w:lang w:val="en-US" w:eastAsia="zh-CN" w:bidi="ar"/>
+        </w:rPr>
+        <w:t>Sequential</w:t>
+      </w:r>
+      <w:r>
+        <w:rPr>
+          <w:rFonts w:hint="default" w:ascii="Consolas" w:hAnsi="Consolas" w:eastAsia="Consolas" w:cs="Consolas"/>
+          <w:b w:val="0"/>
+          <w:bCs w:val="0"/>
+          <w:color w:val="CCCCCC"/>
+          <w:kern w:val="0"/>
+          <w:sz w:val="21"/>
+          <w:szCs w:val="21"/>
+          <w:shd w:val="clear" w:fill="1F1F1F"/>
+          <w:lang w:val="en-US" w:eastAsia="zh-CN" w:bidi="ar"/>
+        </w:rPr>
+        <w:t>(</w:t>
+      </w:r>
+    </w:p>
+    <w:p>
+      <w:pPr>
+        <w:keepNext w:val="0"/>
+        <w:keepLines w:val="0"/>
+        <w:widowControl/>
+        <w:suppressLineNumbers w:val="0"/>
+        <w:shd w:val="clear" w:fill="1F1F1F"/>
+        <w:spacing w:line="143" w:lineRule="atLeast"/>
+        <w:jc w:val="left"/>
+        <w:rPr>
+          <w:rFonts w:hint="default" w:ascii="Consolas" w:hAnsi="Consolas" w:eastAsia="Consolas" w:cs="Consolas"/>
+          <w:b w:val="0"/>
+          <w:bCs w:val="0"/>
+          <w:color w:val="CCCCCC"/>
+          <w:sz w:val="21"/>
+          <w:szCs w:val="21"/>
+        </w:rPr>
+      </w:pPr>
+      <w:r>
+        <w:rPr>
+          <w:rFonts w:hint="default" w:ascii="Consolas" w:hAnsi="Consolas" w:eastAsia="Consolas" w:cs="Consolas"/>
+          <w:b w:val="0"/>
+          <w:bCs w:val="0"/>
+          <w:color w:val="CCCCCC"/>
+          <w:kern w:val="0"/>
+          <w:sz w:val="21"/>
+          <w:szCs w:val="21"/>
+          <w:shd w:val="clear" w:fill="1F1F1F"/>
+          <w:lang w:val="en-US" w:eastAsia="zh-CN" w:bidi="ar"/>
+        </w:rPr>
+        <w:t xml:space="preserve">            </w:t>
+      </w:r>
+      <w:r>
+        <w:rPr>
+          <w:rFonts w:hint="default" w:ascii="Consolas" w:hAnsi="Consolas" w:eastAsia="Consolas" w:cs="Consolas"/>
+          <w:b w:val="0"/>
+          <w:bCs w:val="0"/>
+          <w:color w:val="4EC9B0"/>
+          <w:kern w:val="0"/>
+          <w:sz w:val="21"/>
+          <w:szCs w:val="21"/>
+          <w:shd w:val="clear" w:fill="1F1F1F"/>
+          <w:lang w:val="en-US" w:eastAsia="zh-CN" w:bidi="ar"/>
+        </w:rPr>
+        <w:t>nn</w:t>
+      </w:r>
+      <w:r>
+        <w:rPr>
+          <w:rFonts w:hint="default" w:ascii="Consolas" w:hAnsi="Consolas" w:eastAsia="Consolas" w:cs="Consolas"/>
+          <w:b w:val="0"/>
+          <w:bCs w:val="0"/>
+          <w:color w:val="CCCCCC"/>
+          <w:kern w:val="0"/>
+          <w:sz w:val="21"/>
+          <w:szCs w:val="21"/>
+          <w:shd w:val="clear" w:fill="1F1F1F"/>
+          <w:lang w:val="en-US" w:eastAsia="zh-CN" w:bidi="ar"/>
+        </w:rPr>
+        <w:t>.</w:t>
+      </w:r>
+      <w:r>
+        <w:rPr>
+          <w:rFonts w:hint="default" w:ascii="Consolas" w:hAnsi="Consolas" w:eastAsia="Consolas" w:cs="Consolas"/>
+          <w:b w:val="0"/>
+          <w:bCs w:val="0"/>
+          <w:color w:val="4EC9B0"/>
+          <w:kern w:val="0"/>
+          <w:sz w:val="21"/>
+          <w:szCs w:val="21"/>
+          <w:shd w:val="clear" w:fill="1F1F1F"/>
+          <w:lang w:val="en-US" w:eastAsia="zh-CN" w:bidi="ar"/>
+        </w:rPr>
+        <w:t>Linear</w:t>
+      </w:r>
+      <w:r>
+        <w:rPr>
+          <w:rFonts w:hint="default" w:ascii="Consolas" w:hAnsi="Consolas" w:eastAsia="Consolas" w:cs="Consolas"/>
+          <w:b w:val="0"/>
+          <w:bCs w:val="0"/>
+          <w:color w:val="CCCCCC"/>
+          <w:kern w:val="0"/>
+          <w:sz w:val="21"/>
+          <w:szCs w:val="21"/>
+          <w:shd w:val="clear" w:fill="1F1F1F"/>
+          <w:lang w:val="en-US" w:eastAsia="zh-CN" w:bidi="ar"/>
+        </w:rPr>
+        <w:t>(</w:t>
+      </w:r>
+      <w:r>
+        <w:rPr>
+          <w:rFonts w:hint="default" w:ascii="Consolas" w:hAnsi="Consolas" w:eastAsia="Consolas" w:cs="Consolas"/>
+          <w:b w:val="0"/>
+          <w:bCs w:val="0"/>
+          <w:color w:val="9CDCFE"/>
+          <w:kern w:val="0"/>
+          <w:sz w:val="21"/>
+          <w:szCs w:val="21"/>
+          <w:shd w:val="clear" w:fill="1F1F1F"/>
+          <w:lang w:val="en-US" w:eastAsia="zh-CN" w:bidi="ar"/>
+        </w:rPr>
+        <w:t>input_dim</w:t>
+      </w:r>
+      <w:r>
+        <w:rPr>
+          <w:rFonts w:hint="default" w:ascii="Consolas" w:hAnsi="Consolas" w:eastAsia="Consolas" w:cs="Consolas"/>
+          <w:b w:val="0"/>
+          <w:bCs w:val="0"/>
+          <w:color w:val="CCCCCC"/>
+          <w:kern w:val="0"/>
+          <w:sz w:val="21"/>
+          <w:szCs w:val="21"/>
+          <w:shd w:val="clear" w:fill="1F1F1F"/>
+          <w:lang w:val="en-US" w:eastAsia="zh-CN" w:bidi="ar"/>
+        </w:rPr>
+        <w:t xml:space="preserve">, </w:t>
+      </w:r>
+      <w:r>
+        <w:rPr>
+          <w:rFonts w:hint="default" w:ascii="Consolas" w:hAnsi="Consolas" w:eastAsia="Consolas" w:cs="Consolas"/>
+          <w:b w:val="0"/>
+          <w:bCs w:val="0"/>
+          <w:color w:val="B5CEA8"/>
+          <w:kern w:val="0"/>
+          <w:sz w:val="21"/>
+          <w:szCs w:val="21"/>
+          <w:shd w:val="clear" w:fill="1F1F1F"/>
+          <w:lang w:val="en-US" w:eastAsia="zh-CN" w:bidi="ar"/>
+        </w:rPr>
+        <w:t>256</w:t>
+      </w:r>
+      <w:r>
+        <w:rPr>
+          <w:rFonts w:hint="default" w:ascii="Consolas" w:hAnsi="Consolas" w:eastAsia="Consolas" w:cs="Consolas"/>
+          <w:b w:val="0"/>
+          <w:bCs w:val="0"/>
+          <w:color w:val="CCCCCC"/>
+          <w:kern w:val="0"/>
+          <w:sz w:val="21"/>
+          <w:szCs w:val="21"/>
+          <w:shd w:val="clear" w:fill="1F1F1F"/>
+          <w:lang w:val="en-US" w:eastAsia="zh-CN" w:bidi="ar"/>
+        </w:rPr>
+        <w:t>),</w:t>
+      </w:r>
+    </w:p>
+    <w:p>
+      <w:pPr>
+        <w:keepNext w:val="0"/>
+        <w:keepLines w:val="0"/>
+        <w:widowControl/>
+        <w:suppressLineNumbers w:val="0"/>
+        <w:shd w:val="clear" w:fill="1F1F1F"/>
+        <w:spacing w:line="143" w:lineRule="atLeast"/>
+        <w:jc w:val="left"/>
+        <w:rPr>
+          <w:rFonts w:hint="default" w:ascii="Consolas" w:hAnsi="Consolas" w:eastAsia="Consolas" w:cs="Consolas"/>
+          <w:b w:val="0"/>
+          <w:bCs w:val="0"/>
+          <w:color w:val="CCCCCC"/>
+          <w:sz w:val="21"/>
+          <w:szCs w:val="21"/>
+        </w:rPr>
+      </w:pPr>
+      <w:r>
+        <w:rPr>
+          <w:rFonts w:hint="default" w:ascii="Consolas" w:hAnsi="Consolas" w:eastAsia="Consolas" w:cs="Consolas"/>
+          <w:b w:val="0"/>
+          <w:bCs w:val="0"/>
+          <w:color w:val="CCCCCC"/>
+          <w:kern w:val="0"/>
+          <w:sz w:val="21"/>
+          <w:szCs w:val="21"/>
+          <w:shd w:val="clear" w:fill="1F1F1F"/>
+          <w:lang w:val="en-US" w:eastAsia="zh-CN" w:bidi="ar"/>
+        </w:rPr>
+        <w:t xml:space="preserve">            </w:t>
+      </w:r>
+      <w:r>
+        <w:rPr>
+          <w:rFonts w:hint="default" w:ascii="Consolas" w:hAnsi="Consolas" w:eastAsia="Consolas" w:cs="Consolas"/>
+          <w:b w:val="0"/>
+          <w:bCs w:val="0"/>
+          <w:color w:val="4EC9B0"/>
+          <w:kern w:val="0"/>
+          <w:sz w:val="21"/>
+          <w:szCs w:val="21"/>
+          <w:shd w:val="clear" w:fill="1F1F1F"/>
+          <w:lang w:val="en-US" w:eastAsia="zh-CN" w:bidi="ar"/>
+        </w:rPr>
+        <w:t>nn</w:t>
+      </w:r>
+      <w:r>
+        <w:rPr>
+          <w:rFonts w:hint="default" w:ascii="Consolas" w:hAnsi="Consolas" w:eastAsia="Consolas" w:cs="Consolas"/>
+          <w:b w:val="0"/>
+          <w:bCs w:val="0"/>
+          <w:color w:val="CCCCCC"/>
+          <w:kern w:val="0"/>
+          <w:sz w:val="21"/>
+          <w:szCs w:val="21"/>
+          <w:shd w:val="clear" w:fill="1F1F1F"/>
+          <w:lang w:val="en-US" w:eastAsia="zh-CN" w:bidi="ar"/>
+        </w:rPr>
+        <w:t>.</w:t>
+      </w:r>
+      <w:r>
+        <w:rPr>
+          <w:rFonts w:hint="default" w:ascii="Consolas" w:hAnsi="Consolas" w:eastAsia="Consolas" w:cs="Consolas"/>
+          <w:b w:val="0"/>
+          <w:bCs w:val="0"/>
+          <w:color w:val="4EC9B0"/>
+          <w:kern w:val="0"/>
+          <w:sz w:val="21"/>
+          <w:szCs w:val="21"/>
+          <w:shd w:val="clear" w:fill="1F1F1F"/>
+          <w:lang w:val="en-US" w:eastAsia="zh-CN" w:bidi="ar"/>
+        </w:rPr>
+        <w:t>ReLU</w:t>
+      </w:r>
+      <w:r>
+        <w:rPr>
+          <w:rFonts w:hint="default" w:ascii="Consolas" w:hAnsi="Consolas" w:eastAsia="Consolas" w:cs="Consolas"/>
+          <w:b w:val="0"/>
+          <w:bCs w:val="0"/>
+          <w:color w:val="CCCCCC"/>
+          <w:kern w:val="0"/>
+          <w:sz w:val="21"/>
+          <w:szCs w:val="21"/>
+          <w:shd w:val="clear" w:fill="1F1F1F"/>
+          <w:lang w:val="en-US" w:eastAsia="zh-CN" w:bidi="ar"/>
+        </w:rPr>
+        <w:t>(),</w:t>
+      </w:r>
+    </w:p>
+    <w:p>
+      <w:pPr>
+        <w:keepNext w:val="0"/>
+        <w:keepLines w:val="0"/>
+        <w:widowControl/>
+        <w:suppressLineNumbers w:val="0"/>
+        <w:shd w:val="clear" w:fill="1F1F1F"/>
+        <w:spacing w:line="143" w:lineRule="atLeast"/>
+        <w:jc w:val="left"/>
+        <w:rPr>
+          <w:rFonts w:hint="default" w:ascii="Consolas" w:hAnsi="Consolas" w:eastAsia="Consolas" w:cs="Consolas"/>
+          <w:b w:val="0"/>
+          <w:bCs w:val="0"/>
+          <w:color w:val="CCCCCC"/>
+          <w:sz w:val="21"/>
+          <w:szCs w:val="21"/>
+        </w:rPr>
+      </w:pPr>
+      <w:r>
+        <w:rPr>
+          <w:rFonts w:hint="default" w:ascii="Consolas" w:hAnsi="Consolas" w:eastAsia="Consolas" w:cs="Consolas"/>
+          <w:b w:val="0"/>
+          <w:bCs w:val="0"/>
+          <w:color w:val="CCCCCC"/>
+          <w:kern w:val="0"/>
+          <w:sz w:val="21"/>
+          <w:szCs w:val="21"/>
+          <w:shd w:val="clear" w:fill="1F1F1F"/>
+          <w:lang w:val="en-US" w:eastAsia="zh-CN" w:bidi="ar"/>
+        </w:rPr>
+        <w:t xml:space="preserve">            </w:t>
+      </w:r>
+      <w:r>
+        <w:rPr>
+          <w:rFonts w:hint="default" w:ascii="Consolas" w:hAnsi="Consolas" w:eastAsia="Consolas" w:cs="Consolas"/>
+          <w:b w:val="0"/>
+          <w:bCs w:val="0"/>
+          <w:color w:val="4EC9B0"/>
+          <w:kern w:val="0"/>
+          <w:sz w:val="21"/>
+          <w:szCs w:val="21"/>
+          <w:shd w:val="clear" w:fill="1F1F1F"/>
+          <w:lang w:val="en-US" w:eastAsia="zh-CN" w:bidi="ar"/>
+        </w:rPr>
+        <w:t>nn</w:t>
+      </w:r>
+      <w:r>
+        <w:rPr>
+          <w:rFonts w:hint="default" w:ascii="Consolas" w:hAnsi="Consolas" w:eastAsia="Consolas" w:cs="Consolas"/>
+          <w:b w:val="0"/>
+          <w:bCs w:val="0"/>
+          <w:color w:val="CCCCCC"/>
+          <w:kern w:val="0"/>
+          <w:sz w:val="21"/>
+          <w:szCs w:val="21"/>
+          <w:shd w:val="clear" w:fill="1F1F1F"/>
+          <w:lang w:val="en-US" w:eastAsia="zh-CN" w:bidi="ar"/>
+        </w:rPr>
+        <w:t>.</w:t>
+      </w:r>
+      <w:r>
+        <w:rPr>
+          <w:rFonts w:hint="default" w:ascii="Consolas" w:hAnsi="Consolas" w:eastAsia="Consolas" w:cs="Consolas"/>
+          <w:b w:val="0"/>
+          <w:bCs w:val="0"/>
+          <w:color w:val="4EC9B0"/>
+          <w:kern w:val="0"/>
+          <w:sz w:val="21"/>
+          <w:szCs w:val="21"/>
+          <w:shd w:val="clear" w:fill="1F1F1F"/>
+          <w:lang w:val="en-US" w:eastAsia="zh-CN" w:bidi="ar"/>
+        </w:rPr>
+        <w:t>Dropout</w:t>
+      </w:r>
+      <w:r>
+        <w:rPr>
+          <w:rFonts w:hint="default" w:ascii="Consolas" w:hAnsi="Consolas" w:eastAsia="Consolas" w:cs="Consolas"/>
+          <w:b w:val="0"/>
+          <w:bCs w:val="0"/>
+          <w:color w:val="CCCCCC"/>
+          <w:kern w:val="0"/>
+          <w:sz w:val="21"/>
+          <w:szCs w:val="21"/>
+          <w:shd w:val="clear" w:fill="1F1F1F"/>
+          <w:lang w:val="en-US" w:eastAsia="zh-CN" w:bidi="ar"/>
+        </w:rPr>
+        <w:t>(</w:t>
+      </w:r>
+      <w:r>
+        <w:rPr>
+          <w:rFonts w:hint="default" w:ascii="Consolas" w:hAnsi="Consolas" w:eastAsia="Consolas" w:cs="Consolas"/>
+          <w:b w:val="0"/>
+          <w:bCs w:val="0"/>
+          <w:color w:val="B5CEA8"/>
+          <w:kern w:val="0"/>
+          <w:sz w:val="21"/>
+          <w:szCs w:val="21"/>
+          <w:shd w:val="clear" w:fill="1F1F1F"/>
+          <w:lang w:val="en-US" w:eastAsia="zh-CN" w:bidi="ar"/>
+        </w:rPr>
+        <w:t>0.1</w:t>
+      </w:r>
+      <w:r>
+        <w:rPr>
+          <w:rFonts w:hint="default" w:ascii="Consolas" w:hAnsi="Consolas" w:eastAsia="Consolas" w:cs="Consolas"/>
+          <w:b w:val="0"/>
+          <w:bCs w:val="0"/>
+          <w:color w:val="CCCCCC"/>
+          <w:kern w:val="0"/>
+          <w:sz w:val="21"/>
+          <w:szCs w:val="21"/>
+          <w:shd w:val="clear" w:fill="1F1F1F"/>
+          <w:lang w:val="en-US" w:eastAsia="zh-CN" w:bidi="ar"/>
+        </w:rPr>
+        <w:t>),</w:t>
+      </w:r>
+    </w:p>
+    <w:p>
+      <w:pPr>
+        <w:keepNext w:val="0"/>
+        <w:keepLines w:val="0"/>
+        <w:widowControl/>
+        <w:suppressLineNumbers w:val="0"/>
+        <w:shd w:val="clear" w:fill="1F1F1F"/>
+        <w:spacing w:line="143" w:lineRule="atLeast"/>
+        <w:jc w:val="left"/>
+        <w:rPr>
+          <w:rFonts w:hint="default" w:ascii="Consolas" w:hAnsi="Consolas" w:eastAsia="Consolas" w:cs="Consolas"/>
+          <w:b w:val="0"/>
+          <w:bCs w:val="0"/>
+          <w:color w:val="CCCCCC"/>
+          <w:sz w:val="21"/>
+          <w:szCs w:val="21"/>
+        </w:rPr>
+      </w:pPr>
+      <w:r>
+        <w:rPr>
+          <w:rFonts w:hint="default" w:ascii="Consolas" w:hAnsi="Consolas" w:eastAsia="Consolas" w:cs="Consolas"/>
+          <w:b w:val="0"/>
+          <w:bCs w:val="0"/>
+          <w:color w:val="CCCCCC"/>
+          <w:kern w:val="0"/>
+          <w:sz w:val="21"/>
+          <w:szCs w:val="21"/>
+          <w:shd w:val="clear" w:fill="1F1F1F"/>
+          <w:lang w:val="en-US" w:eastAsia="zh-CN" w:bidi="ar"/>
+        </w:rPr>
+        <w:t xml:space="preserve">            </w:t>
+      </w:r>
+      <w:r>
+        <w:rPr>
+          <w:rFonts w:hint="default" w:ascii="Consolas" w:hAnsi="Consolas" w:eastAsia="Consolas" w:cs="Consolas"/>
+          <w:b w:val="0"/>
+          <w:bCs w:val="0"/>
+          <w:color w:val="4EC9B0"/>
+          <w:kern w:val="0"/>
+          <w:sz w:val="21"/>
+          <w:szCs w:val="21"/>
+          <w:shd w:val="clear" w:fill="1F1F1F"/>
+          <w:lang w:val="en-US" w:eastAsia="zh-CN" w:bidi="ar"/>
+        </w:rPr>
+        <w:t>nn</w:t>
+      </w:r>
+      <w:r>
+        <w:rPr>
+          <w:rFonts w:hint="default" w:ascii="Consolas" w:hAnsi="Consolas" w:eastAsia="Consolas" w:cs="Consolas"/>
+          <w:b w:val="0"/>
+          <w:bCs w:val="0"/>
+          <w:color w:val="CCCCCC"/>
+          <w:kern w:val="0"/>
+          <w:sz w:val="21"/>
+          <w:szCs w:val="21"/>
+          <w:shd w:val="clear" w:fill="1F1F1F"/>
+          <w:lang w:val="en-US" w:eastAsia="zh-CN" w:bidi="ar"/>
+        </w:rPr>
+        <w:t>.</w:t>
+      </w:r>
+      <w:r>
+        <w:rPr>
+          <w:rFonts w:hint="default" w:ascii="Consolas" w:hAnsi="Consolas" w:eastAsia="Consolas" w:cs="Consolas"/>
+          <w:b w:val="0"/>
+          <w:bCs w:val="0"/>
+          <w:color w:val="4EC9B0"/>
+          <w:kern w:val="0"/>
+          <w:sz w:val="21"/>
+          <w:szCs w:val="21"/>
+          <w:shd w:val="clear" w:fill="1F1F1F"/>
+          <w:lang w:val="en-US" w:eastAsia="zh-CN" w:bidi="ar"/>
+        </w:rPr>
+        <w:t>Linear</w:t>
+      </w:r>
+      <w:r>
+        <w:rPr>
+          <w:rFonts w:hint="default" w:ascii="Consolas" w:hAnsi="Consolas" w:eastAsia="Consolas" w:cs="Consolas"/>
+          <w:b w:val="0"/>
+          <w:bCs w:val="0"/>
+          <w:color w:val="CCCCCC"/>
+          <w:kern w:val="0"/>
+          <w:sz w:val="21"/>
+          <w:szCs w:val="21"/>
+          <w:shd w:val="clear" w:fill="1F1F1F"/>
+          <w:lang w:val="en-US" w:eastAsia="zh-CN" w:bidi="ar"/>
+        </w:rPr>
+        <w:t>(</w:t>
+      </w:r>
+      <w:r>
+        <w:rPr>
+          <w:rFonts w:hint="default" w:ascii="Consolas" w:hAnsi="Consolas" w:eastAsia="Consolas" w:cs="Consolas"/>
+          <w:b w:val="0"/>
+          <w:bCs w:val="0"/>
+          <w:color w:val="B5CEA8"/>
+          <w:kern w:val="0"/>
+          <w:sz w:val="21"/>
+          <w:szCs w:val="21"/>
+          <w:shd w:val="clear" w:fill="1F1F1F"/>
+          <w:lang w:val="en-US" w:eastAsia="zh-CN" w:bidi="ar"/>
+        </w:rPr>
+        <w:t>256</w:t>
+      </w:r>
+      <w:r>
+        <w:rPr>
+          <w:rFonts w:hint="default" w:ascii="Consolas" w:hAnsi="Consolas" w:eastAsia="Consolas" w:cs="Consolas"/>
+          <w:b w:val="0"/>
+          <w:bCs w:val="0"/>
+          <w:color w:val="CCCCCC"/>
+          <w:kern w:val="0"/>
+          <w:sz w:val="21"/>
+          <w:szCs w:val="21"/>
+          <w:shd w:val="clear" w:fill="1F1F1F"/>
+          <w:lang w:val="en-US" w:eastAsia="zh-CN" w:bidi="ar"/>
+        </w:rPr>
+        <w:t xml:space="preserve">, </w:t>
+      </w:r>
+      <w:r>
+        <w:rPr>
+          <w:rFonts w:hint="default" w:ascii="Consolas" w:hAnsi="Consolas" w:eastAsia="Consolas" w:cs="Consolas"/>
+          <w:b w:val="0"/>
+          <w:bCs w:val="0"/>
+          <w:color w:val="B5CEA8"/>
+          <w:kern w:val="0"/>
+          <w:sz w:val="21"/>
+          <w:szCs w:val="21"/>
+          <w:shd w:val="clear" w:fill="1F1F1F"/>
+          <w:lang w:val="en-US" w:eastAsia="zh-CN" w:bidi="ar"/>
+        </w:rPr>
+        <w:t>128</w:t>
+      </w:r>
+      <w:r>
+        <w:rPr>
+          <w:rFonts w:hint="default" w:ascii="Consolas" w:hAnsi="Consolas" w:eastAsia="Consolas" w:cs="Consolas"/>
+          <w:b w:val="0"/>
+          <w:bCs w:val="0"/>
+          <w:color w:val="CCCCCC"/>
+          <w:kern w:val="0"/>
+          <w:sz w:val="21"/>
+          <w:szCs w:val="21"/>
+          <w:shd w:val="clear" w:fill="1F1F1F"/>
+          <w:lang w:val="en-US" w:eastAsia="zh-CN" w:bidi="ar"/>
+        </w:rPr>
+        <w:t>),</w:t>
+      </w:r>
+    </w:p>
+    <w:p>
+      <w:pPr>
+        <w:keepNext w:val="0"/>
+        <w:keepLines w:val="0"/>
+        <w:widowControl/>
+        <w:suppressLineNumbers w:val="0"/>
+        <w:shd w:val="clear" w:fill="1F1F1F"/>
+        <w:spacing w:line="143" w:lineRule="atLeast"/>
+        <w:jc w:val="left"/>
+        <w:rPr>
+          <w:rFonts w:hint="default" w:ascii="Consolas" w:hAnsi="Consolas" w:eastAsia="Consolas" w:cs="Consolas"/>
+          <w:b w:val="0"/>
+          <w:bCs w:val="0"/>
+          <w:color w:val="CCCCCC"/>
+          <w:sz w:val="21"/>
+          <w:szCs w:val="21"/>
+        </w:rPr>
+      </w:pPr>
+      <w:r>
+        <w:rPr>
+          <w:rFonts w:hint="default" w:ascii="Consolas" w:hAnsi="Consolas" w:eastAsia="Consolas" w:cs="Consolas"/>
+          <w:b w:val="0"/>
+          <w:bCs w:val="0"/>
+          <w:color w:val="CCCCCC"/>
+          <w:kern w:val="0"/>
+          <w:sz w:val="21"/>
+          <w:szCs w:val="21"/>
+          <w:shd w:val="clear" w:fill="1F1F1F"/>
+          <w:lang w:val="en-US" w:eastAsia="zh-CN" w:bidi="ar"/>
+        </w:rPr>
+        <w:t xml:space="preserve">            </w:t>
+      </w:r>
+      <w:r>
+        <w:rPr>
+          <w:rFonts w:hint="default" w:ascii="Consolas" w:hAnsi="Consolas" w:eastAsia="Consolas" w:cs="Consolas"/>
+          <w:b w:val="0"/>
+          <w:bCs w:val="0"/>
+          <w:color w:val="4EC9B0"/>
+          <w:kern w:val="0"/>
+          <w:sz w:val="21"/>
+          <w:szCs w:val="21"/>
+          <w:shd w:val="clear" w:fill="1F1F1F"/>
+          <w:lang w:val="en-US" w:eastAsia="zh-CN" w:bidi="ar"/>
+        </w:rPr>
+        <w:t>nn</w:t>
+      </w:r>
+      <w:r>
+        <w:rPr>
+          <w:rFonts w:hint="default" w:ascii="Consolas" w:hAnsi="Consolas" w:eastAsia="Consolas" w:cs="Consolas"/>
+          <w:b w:val="0"/>
+          <w:bCs w:val="0"/>
+          <w:color w:val="CCCCCC"/>
+          <w:kern w:val="0"/>
+          <w:sz w:val="21"/>
+          <w:szCs w:val="21"/>
+          <w:shd w:val="clear" w:fill="1F1F1F"/>
+          <w:lang w:val="en-US" w:eastAsia="zh-CN" w:bidi="ar"/>
+        </w:rPr>
+        <w:t>.</w:t>
+      </w:r>
+      <w:r>
+        <w:rPr>
+          <w:rFonts w:hint="default" w:ascii="Consolas" w:hAnsi="Consolas" w:eastAsia="Consolas" w:cs="Consolas"/>
+          <w:b w:val="0"/>
+          <w:bCs w:val="0"/>
+          <w:color w:val="4EC9B0"/>
+          <w:kern w:val="0"/>
+          <w:sz w:val="21"/>
+          <w:szCs w:val="21"/>
+          <w:shd w:val="clear" w:fill="1F1F1F"/>
+          <w:lang w:val="en-US" w:eastAsia="zh-CN" w:bidi="ar"/>
+        </w:rPr>
+        <w:t>ReLU</w:t>
+      </w:r>
+      <w:r>
+        <w:rPr>
+          <w:rFonts w:hint="default" w:ascii="Consolas" w:hAnsi="Consolas" w:eastAsia="Consolas" w:cs="Consolas"/>
+          <w:b w:val="0"/>
+          <w:bCs w:val="0"/>
+          <w:color w:val="CCCCCC"/>
+          <w:kern w:val="0"/>
+          <w:sz w:val="21"/>
+          <w:szCs w:val="21"/>
+          <w:shd w:val="clear" w:fill="1F1F1F"/>
+          <w:lang w:val="en-US" w:eastAsia="zh-CN" w:bidi="ar"/>
+        </w:rPr>
+        <w:t>(),</w:t>
+      </w:r>
+    </w:p>
+    <w:p>
+      <w:pPr>
+        <w:keepNext w:val="0"/>
+        <w:keepLines w:val="0"/>
+        <w:widowControl/>
+        <w:suppressLineNumbers w:val="0"/>
+        <w:shd w:val="clear" w:fill="1F1F1F"/>
+        <w:spacing w:line="143" w:lineRule="atLeast"/>
+        <w:jc w:val="left"/>
+        <w:rPr>
+          <w:rFonts w:hint="default" w:ascii="Consolas" w:hAnsi="Consolas" w:eastAsia="Consolas" w:cs="Consolas"/>
+          <w:b w:val="0"/>
+          <w:bCs w:val="0"/>
+          <w:color w:val="CCCCCC"/>
+          <w:sz w:val="21"/>
+          <w:szCs w:val="21"/>
+        </w:rPr>
+      </w:pPr>
+      <w:r>
+        <w:rPr>
+          <w:rFonts w:hint="default" w:ascii="Consolas" w:hAnsi="Consolas" w:eastAsia="Consolas" w:cs="Consolas"/>
+          <w:b w:val="0"/>
+          <w:bCs w:val="0"/>
+          <w:color w:val="CCCCCC"/>
+          <w:kern w:val="0"/>
+          <w:sz w:val="21"/>
+          <w:szCs w:val="21"/>
+          <w:shd w:val="clear" w:fill="1F1F1F"/>
+          <w:lang w:val="en-US" w:eastAsia="zh-CN" w:bidi="ar"/>
+        </w:rPr>
+        <w:t xml:space="preserve">            </w:t>
+      </w:r>
+      <w:r>
+        <w:rPr>
+          <w:rFonts w:hint="default" w:ascii="Consolas" w:hAnsi="Consolas" w:eastAsia="Consolas" w:cs="Consolas"/>
+          <w:b w:val="0"/>
+          <w:bCs w:val="0"/>
+          <w:color w:val="4EC9B0"/>
+          <w:kern w:val="0"/>
+          <w:sz w:val="21"/>
+          <w:szCs w:val="21"/>
+          <w:shd w:val="clear" w:fill="1F1F1F"/>
+          <w:lang w:val="en-US" w:eastAsia="zh-CN" w:bidi="ar"/>
+        </w:rPr>
+        <w:t>nn</w:t>
+      </w:r>
+      <w:r>
+        <w:rPr>
+          <w:rFonts w:hint="default" w:ascii="Consolas" w:hAnsi="Consolas" w:eastAsia="Consolas" w:cs="Consolas"/>
+          <w:b w:val="0"/>
+          <w:bCs w:val="0"/>
+          <w:color w:val="CCCCCC"/>
+          <w:kern w:val="0"/>
+          <w:sz w:val="21"/>
+          <w:szCs w:val="21"/>
+          <w:shd w:val="clear" w:fill="1F1F1F"/>
+          <w:lang w:val="en-US" w:eastAsia="zh-CN" w:bidi="ar"/>
+        </w:rPr>
+        <w:t>.</w:t>
+      </w:r>
+      <w:r>
+        <w:rPr>
+          <w:rFonts w:hint="default" w:ascii="Consolas" w:hAnsi="Consolas" w:eastAsia="Consolas" w:cs="Consolas"/>
+          <w:b w:val="0"/>
+          <w:bCs w:val="0"/>
+          <w:color w:val="4EC9B0"/>
+          <w:kern w:val="0"/>
+          <w:sz w:val="21"/>
+          <w:szCs w:val="21"/>
+          <w:shd w:val="clear" w:fill="1F1F1F"/>
+          <w:lang w:val="en-US" w:eastAsia="zh-CN" w:bidi="ar"/>
+        </w:rPr>
+        <w:t>Linear</w:t>
+      </w:r>
+      <w:r>
+        <w:rPr>
+          <w:rFonts w:hint="default" w:ascii="Consolas" w:hAnsi="Consolas" w:eastAsia="Consolas" w:cs="Consolas"/>
+          <w:b w:val="0"/>
+          <w:bCs w:val="0"/>
+          <w:color w:val="CCCCCC"/>
+          <w:kern w:val="0"/>
+          <w:sz w:val="21"/>
+          <w:szCs w:val="21"/>
+          <w:shd w:val="clear" w:fill="1F1F1F"/>
+          <w:lang w:val="en-US" w:eastAsia="zh-CN" w:bidi="ar"/>
+        </w:rPr>
+        <w:t>(</w:t>
+      </w:r>
+      <w:r>
+        <w:rPr>
+          <w:rFonts w:hint="default" w:ascii="Consolas" w:hAnsi="Consolas" w:eastAsia="Consolas" w:cs="Consolas"/>
+          <w:b w:val="0"/>
+          <w:bCs w:val="0"/>
+          <w:color w:val="B5CEA8"/>
+          <w:kern w:val="0"/>
+          <w:sz w:val="21"/>
+          <w:szCs w:val="21"/>
+          <w:shd w:val="clear" w:fill="1F1F1F"/>
+          <w:lang w:val="en-US" w:eastAsia="zh-CN" w:bidi="ar"/>
+        </w:rPr>
+        <w:t>128</w:t>
+      </w:r>
+      <w:r>
+        <w:rPr>
+          <w:rFonts w:hint="default" w:ascii="Consolas" w:hAnsi="Consolas" w:eastAsia="Consolas" w:cs="Consolas"/>
+          <w:b w:val="0"/>
+          <w:bCs w:val="0"/>
+          <w:color w:val="CCCCCC"/>
+          <w:kern w:val="0"/>
+          <w:sz w:val="21"/>
+          <w:szCs w:val="21"/>
+          <w:shd w:val="clear" w:fill="1F1F1F"/>
+          <w:lang w:val="en-US" w:eastAsia="zh-CN" w:bidi="ar"/>
+        </w:rPr>
+        <w:t xml:space="preserve">, </w:t>
+      </w:r>
+      <w:r>
+        <w:rPr>
+          <w:rFonts w:hint="default" w:ascii="Consolas" w:hAnsi="Consolas" w:eastAsia="Consolas" w:cs="Consolas"/>
+          <w:b w:val="0"/>
+          <w:bCs w:val="0"/>
+          <w:color w:val="9CDCFE"/>
+          <w:kern w:val="0"/>
+          <w:sz w:val="21"/>
+          <w:szCs w:val="21"/>
+          <w:shd w:val="clear" w:fill="1F1F1F"/>
+          <w:lang w:val="en-US" w:eastAsia="zh-CN" w:bidi="ar"/>
+        </w:rPr>
+        <w:t>latent_dim</w:t>
+      </w:r>
+      <w:r>
+        <w:rPr>
+          <w:rFonts w:hint="default" w:ascii="Consolas" w:hAnsi="Consolas" w:eastAsia="Consolas" w:cs="Consolas"/>
+          <w:b w:val="0"/>
+          <w:bCs w:val="0"/>
+          <w:color w:val="CCCCCC"/>
+          <w:kern w:val="0"/>
+          <w:sz w:val="21"/>
+          <w:szCs w:val="21"/>
+          <w:shd w:val="clear" w:fill="1F1F1F"/>
+          <w:lang w:val="en-US" w:eastAsia="zh-CN" w:bidi="ar"/>
+        </w:rPr>
+        <w:t>),</w:t>
+      </w:r>
+    </w:p>
+    <w:p>
+      <w:pPr>
+        <w:keepNext w:val="0"/>
+        <w:keepLines w:val="0"/>
+        <w:widowControl/>
+        <w:suppressLineNumbers w:val="0"/>
+        <w:shd w:val="clear" w:fill="1F1F1F"/>
+        <w:spacing w:line="143" w:lineRule="atLeast"/>
+        <w:jc w:val="left"/>
+        <w:rPr>
+          <w:rFonts w:hint="default" w:ascii="Consolas" w:hAnsi="Consolas" w:eastAsia="Consolas" w:cs="Consolas"/>
+          <w:b w:val="0"/>
+          <w:bCs w:val="0"/>
+          <w:color w:val="CCCCCC"/>
+          <w:sz w:val="21"/>
+          <w:szCs w:val="21"/>
+        </w:rPr>
+      </w:pPr>
+      <w:r>
+        <w:rPr>
+          <w:rFonts w:hint="default" w:ascii="Consolas" w:hAnsi="Consolas" w:eastAsia="Consolas" w:cs="Consolas"/>
+          <w:b w:val="0"/>
+          <w:bCs w:val="0"/>
+          <w:color w:val="CCCCCC"/>
+          <w:kern w:val="0"/>
+          <w:sz w:val="21"/>
+          <w:szCs w:val="21"/>
+          <w:shd w:val="clear" w:fill="1F1F1F"/>
+          <w:lang w:val="en-US" w:eastAsia="zh-CN" w:bidi="ar"/>
+        </w:rPr>
+        <w:t>        )</w:t>
+      </w:r>
+    </w:p>
+    <w:p>
+      <w:pPr>
+        <w:keepNext w:val="0"/>
+        <w:keepLines w:val="0"/>
+        <w:widowControl/>
+        <w:suppressLineNumbers w:val="0"/>
+        <w:shd w:val="clear" w:fill="1F1F1F"/>
+        <w:spacing w:line="143" w:lineRule="atLeast"/>
+        <w:jc w:val="left"/>
+        <w:rPr>
+          <w:rFonts w:hint="default" w:ascii="Consolas" w:hAnsi="Consolas" w:eastAsia="Consolas" w:cs="Consolas"/>
+          <w:b w:val="0"/>
+          <w:bCs w:val="0"/>
+          <w:color w:val="CCCCCC"/>
+          <w:sz w:val="21"/>
+          <w:szCs w:val="21"/>
+        </w:rPr>
+      </w:pPr>
+      <w:r>
+        <w:rPr>
+          <w:rFonts w:hint="default" w:ascii="Consolas" w:hAnsi="Consolas" w:eastAsia="Consolas" w:cs="Consolas"/>
+          <w:b w:val="0"/>
+          <w:bCs w:val="0"/>
+          <w:color w:val="CCCCCC"/>
+          <w:kern w:val="0"/>
+          <w:sz w:val="21"/>
+          <w:szCs w:val="21"/>
+          <w:shd w:val="clear" w:fill="1F1F1F"/>
+          <w:lang w:val="en-US" w:eastAsia="zh-CN" w:bidi="ar"/>
+        </w:rPr>
+        <w:t xml:space="preserve">        </w:t>
+      </w:r>
+      <w:r>
+        <w:rPr>
+          <w:rFonts w:hint="default" w:ascii="Consolas" w:hAnsi="Consolas" w:eastAsia="Consolas" w:cs="Consolas"/>
+          <w:b w:val="0"/>
+          <w:bCs w:val="0"/>
+          <w:color w:val="9CDCFE"/>
+          <w:kern w:val="0"/>
+          <w:sz w:val="21"/>
+          <w:szCs w:val="21"/>
+          <w:shd w:val="clear" w:fill="1F1F1F"/>
+          <w:lang w:val="en-US" w:eastAsia="zh-CN" w:bidi="ar"/>
+        </w:rPr>
+        <w:t>self</w:t>
+      </w:r>
+      <w:r>
+        <w:rPr>
+          <w:rFonts w:hint="default" w:ascii="Consolas" w:hAnsi="Consolas" w:eastAsia="Consolas" w:cs="Consolas"/>
+          <w:b w:val="0"/>
+          <w:bCs w:val="0"/>
+          <w:color w:val="CCCCCC"/>
+          <w:kern w:val="0"/>
+          <w:sz w:val="21"/>
+          <w:szCs w:val="21"/>
+          <w:shd w:val="clear" w:fill="1F1F1F"/>
+          <w:lang w:val="en-US" w:eastAsia="zh-CN" w:bidi="ar"/>
+        </w:rPr>
+        <w:t>.</w:t>
+      </w:r>
+      <w:r>
+        <w:rPr>
+          <w:rFonts w:hint="default" w:ascii="Consolas" w:hAnsi="Consolas" w:eastAsia="Consolas" w:cs="Consolas"/>
+          <w:b w:val="0"/>
+          <w:bCs w:val="0"/>
+          <w:color w:val="9CDCFE"/>
+          <w:kern w:val="0"/>
+          <w:sz w:val="21"/>
+          <w:szCs w:val="21"/>
+          <w:shd w:val="clear" w:fill="1F1F1F"/>
+          <w:lang w:val="en-US" w:eastAsia="zh-CN" w:bidi="ar"/>
+        </w:rPr>
+        <w:t>decoder</w:t>
+      </w:r>
+      <w:r>
+        <w:rPr>
+          <w:rFonts w:hint="default" w:ascii="Consolas" w:hAnsi="Consolas" w:eastAsia="Consolas" w:cs="Consolas"/>
+          <w:b w:val="0"/>
+          <w:bCs w:val="0"/>
+          <w:color w:val="CCCCCC"/>
+          <w:kern w:val="0"/>
+          <w:sz w:val="21"/>
+          <w:szCs w:val="21"/>
+          <w:shd w:val="clear" w:fill="1F1F1F"/>
+          <w:lang w:val="en-US" w:eastAsia="zh-CN" w:bidi="ar"/>
+        </w:rPr>
+        <w:t xml:space="preserve"> </w:t>
+      </w:r>
+      <w:r>
+        <w:rPr>
+          <w:rFonts w:hint="default" w:ascii="Consolas" w:hAnsi="Consolas" w:eastAsia="Consolas" w:cs="Consolas"/>
+          <w:b w:val="0"/>
+          <w:bCs w:val="0"/>
+          <w:color w:val="D4D4D4"/>
+          <w:kern w:val="0"/>
+          <w:sz w:val="21"/>
+          <w:szCs w:val="21"/>
+          <w:shd w:val="clear" w:fill="1F1F1F"/>
+          <w:lang w:val="en-US" w:eastAsia="zh-CN" w:bidi="ar"/>
+        </w:rPr>
+        <w:t>=</w:t>
+      </w:r>
+      <w:r>
+        <w:rPr>
+          <w:rFonts w:hint="default" w:ascii="Consolas" w:hAnsi="Consolas" w:eastAsia="Consolas" w:cs="Consolas"/>
+          <w:b w:val="0"/>
+          <w:bCs w:val="0"/>
+          <w:color w:val="CCCCCC"/>
+          <w:kern w:val="0"/>
+          <w:sz w:val="21"/>
+          <w:szCs w:val="21"/>
+          <w:shd w:val="clear" w:fill="1F1F1F"/>
+          <w:lang w:val="en-US" w:eastAsia="zh-CN" w:bidi="ar"/>
+        </w:rPr>
+        <w:t xml:space="preserve"> </w:t>
+      </w:r>
+      <w:r>
+        <w:rPr>
+          <w:rFonts w:hint="default" w:ascii="Consolas" w:hAnsi="Consolas" w:eastAsia="Consolas" w:cs="Consolas"/>
+          <w:b w:val="0"/>
+          <w:bCs w:val="0"/>
+          <w:color w:val="4EC9B0"/>
+          <w:kern w:val="0"/>
+          <w:sz w:val="21"/>
+          <w:szCs w:val="21"/>
+          <w:shd w:val="clear" w:fill="1F1F1F"/>
+          <w:lang w:val="en-US" w:eastAsia="zh-CN" w:bidi="ar"/>
+        </w:rPr>
+        <w:t>nn</w:t>
+      </w:r>
+      <w:r>
+        <w:rPr>
+          <w:rFonts w:hint="default" w:ascii="Consolas" w:hAnsi="Consolas" w:eastAsia="Consolas" w:cs="Consolas"/>
+          <w:b w:val="0"/>
+          <w:bCs w:val="0"/>
+          <w:color w:val="CCCCCC"/>
+          <w:kern w:val="0"/>
+          <w:sz w:val="21"/>
+          <w:szCs w:val="21"/>
+          <w:shd w:val="clear" w:fill="1F1F1F"/>
+          <w:lang w:val="en-US" w:eastAsia="zh-CN" w:bidi="ar"/>
+        </w:rPr>
+        <w:t>.</w:t>
+      </w:r>
+      <w:r>
+        <w:rPr>
+          <w:rFonts w:hint="default" w:ascii="Consolas" w:hAnsi="Consolas" w:eastAsia="Consolas" w:cs="Consolas"/>
+          <w:b w:val="0"/>
+          <w:bCs w:val="0"/>
+          <w:color w:val="4EC9B0"/>
+          <w:kern w:val="0"/>
+          <w:sz w:val="21"/>
+          <w:szCs w:val="21"/>
+          <w:shd w:val="clear" w:fill="1F1F1F"/>
+          <w:lang w:val="en-US" w:eastAsia="zh-CN" w:bidi="ar"/>
+        </w:rPr>
+        <w:t>Sequential</w:t>
+      </w:r>
+      <w:r>
+        <w:rPr>
+          <w:rFonts w:hint="default" w:ascii="Consolas" w:hAnsi="Consolas" w:eastAsia="Consolas" w:cs="Consolas"/>
+          <w:b w:val="0"/>
+          <w:bCs w:val="0"/>
+          <w:color w:val="CCCCCC"/>
+          <w:kern w:val="0"/>
+          <w:sz w:val="21"/>
+          <w:szCs w:val="21"/>
+          <w:shd w:val="clear" w:fill="1F1F1F"/>
+          <w:lang w:val="en-US" w:eastAsia="zh-CN" w:bidi="ar"/>
+        </w:rPr>
+        <w:t>(</w:t>
+      </w:r>
+    </w:p>
+    <w:p>
+      <w:pPr>
+        <w:keepNext w:val="0"/>
+        <w:keepLines w:val="0"/>
+        <w:widowControl/>
+        <w:suppressLineNumbers w:val="0"/>
+        <w:shd w:val="clear" w:fill="1F1F1F"/>
+        <w:spacing w:line="143" w:lineRule="atLeast"/>
+        <w:jc w:val="left"/>
+        <w:rPr>
+          <w:rFonts w:hint="default" w:ascii="Consolas" w:hAnsi="Consolas" w:eastAsia="Consolas" w:cs="Consolas"/>
+          <w:b w:val="0"/>
+          <w:bCs w:val="0"/>
+          <w:color w:val="CCCCCC"/>
+          <w:sz w:val="21"/>
+          <w:szCs w:val="21"/>
+        </w:rPr>
+      </w:pPr>
+      <w:r>
+        <w:rPr>
+          <w:rFonts w:hint="default" w:ascii="Consolas" w:hAnsi="Consolas" w:eastAsia="Consolas" w:cs="Consolas"/>
+          <w:b w:val="0"/>
+          <w:bCs w:val="0"/>
+          <w:color w:val="CCCCCC"/>
+          <w:kern w:val="0"/>
+          <w:sz w:val="21"/>
+          <w:szCs w:val="21"/>
+          <w:shd w:val="clear" w:fill="1F1F1F"/>
+          <w:lang w:val="en-US" w:eastAsia="zh-CN" w:bidi="ar"/>
+        </w:rPr>
+        <w:t xml:space="preserve">            </w:t>
+      </w:r>
+      <w:r>
+        <w:rPr>
+          <w:rFonts w:hint="default" w:ascii="Consolas" w:hAnsi="Consolas" w:eastAsia="Consolas" w:cs="Consolas"/>
+          <w:b w:val="0"/>
+          <w:bCs w:val="0"/>
+          <w:color w:val="4EC9B0"/>
+          <w:kern w:val="0"/>
+          <w:sz w:val="21"/>
+          <w:szCs w:val="21"/>
+          <w:shd w:val="clear" w:fill="1F1F1F"/>
+          <w:lang w:val="en-US" w:eastAsia="zh-CN" w:bidi="ar"/>
+        </w:rPr>
+        <w:t>nn</w:t>
+      </w:r>
+      <w:r>
+        <w:rPr>
+          <w:rFonts w:hint="default" w:ascii="Consolas" w:hAnsi="Consolas" w:eastAsia="Consolas" w:cs="Consolas"/>
+          <w:b w:val="0"/>
+          <w:bCs w:val="0"/>
+          <w:color w:val="CCCCCC"/>
+          <w:kern w:val="0"/>
+          <w:sz w:val="21"/>
+          <w:szCs w:val="21"/>
+          <w:shd w:val="clear" w:fill="1F1F1F"/>
+          <w:lang w:val="en-US" w:eastAsia="zh-CN" w:bidi="ar"/>
+        </w:rPr>
+        <w:t>.</w:t>
+      </w:r>
+      <w:r>
+        <w:rPr>
+          <w:rFonts w:hint="default" w:ascii="Consolas" w:hAnsi="Consolas" w:eastAsia="Consolas" w:cs="Consolas"/>
+          <w:b w:val="0"/>
+          <w:bCs w:val="0"/>
+          <w:color w:val="4EC9B0"/>
+          <w:kern w:val="0"/>
+          <w:sz w:val="21"/>
+          <w:szCs w:val="21"/>
+          <w:shd w:val="clear" w:fill="1F1F1F"/>
+          <w:lang w:val="en-US" w:eastAsia="zh-CN" w:bidi="ar"/>
+        </w:rPr>
+        <w:t>Linear</w:t>
+      </w:r>
+      <w:r>
+        <w:rPr>
+          <w:rFonts w:hint="default" w:ascii="Consolas" w:hAnsi="Consolas" w:eastAsia="Consolas" w:cs="Consolas"/>
+          <w:b w:val="0"/>
+          <w:bCs w:val="0"/>
+          <w:color w:val="CCCCCC"/>
+          <w:kern w:val="0"/>
+          <w:sz w:val="21"/>
+          <w:szCs w:val="21"/>
+          <w:shd w:val="clear" w:fill="1F1F1F"/>
+          <w:lang w:val="en-US" w:eastAsia="zh-CN" w:bidi="ar"/>
+        </w:rPr>
+        <w:t>(</w:t>
+      </w:r>
+      <w:r>
+        <w:rPr>
+          <w:rFonts w:hint="default" w:ascii="Consolas" w:hAnsi="Consolas" w:eastAsia="Consolas" w:cs="Consolas"/>
+          <w:b w:val="0"/>
+          <w:bCs w:val="0"/>
+          <w:color w:val="9CDCFE"/>
+          <w:kern w:val="0"/>
+          <w:sz w:val="21"/>
+          <w:szCs w:val="21"/>
+          <w:shd w:val="clear" w:fill="1F1F1F"/>
+          <w:lang w:val="en-US" w:eastAsia="zh-CN" w:bidi="ar"/>
+        </w:rPr>
+        <w:t>latent_dim</w:t>
+      </w:r>
+      <w:r>
+        <w:rPr>
+          <w:rFonts w:hint="default" w:ascii="Consolas" w:hAnsi="Consolas" w:eastAsia="Consolas" w:cs="Consolas"/>
+          <w:b w:val="0"/>
+          <w:bCs w:val="0"/>
+          <w:color w:val="CCCCCC"/>
+          <w:kern w:val="0"/>
+          <w:sz w:val="21"/>
+          <w:szCs w:val="21"/>
+          <w:shd w:val="clear" w:fill="1F1F1F"/>
+          <w:lang w:val="en-US" w:eastAsia="zh-CN" w:bidi="ar"/>
+        </w:rPr>
+        <w:t xml:space="preserve">, </w:t>
+      </w:r>
+      <w:r>
+        <w:rPr>
+          <w:rFonts w:hint="default" w:ascii="Consolas" w:hAnsi="Consolas" w:eastAsia="Consolas" w:cs="Consolas"/>
+          <w:b w:val="0"/>
+          <w:bCs w:val="0"/>
+          <w:color w:val="B5CEA8"/>
+          <w:kern w:val="0"/>
+          <w:sz w:val="21"/>
+          <w:szCs w:val="21"/>
+          <w:shd w:val="clear" w:fill="1F1F1F"/>
+          <w:lang w:val="en-US" w:eastAsia="zh-CN" w:bidi="ar"/>
+        </w:rPr>
+        <w:t>128</w:t>
+      </w:r>
+      <w:r>
+        <w:rPr>
+          <w:rFonts w:hint="default" w:ascii="Consolas" w:hAnsi="Consolas" w:eastAsia="Consolas" w:cs="Consolas"/>
+          <w:b w:val="0"/>
+          <w:bCs w:val="0"/>
+          <w:color w:val="CCCCCC"/>
+          <w:kern w:val="0"/>
+          <w:sz w:val="21"/>
+          <w:szCs w:val="21"/>
+          <w:shd w:val="clear" w:fill="1F1F1F"/>
+          <w:lang w:val="en-US" w:eastAsia="zh-CN" w:bidi="ar"/>
+        </w:rPr>
+        <w:t>),</w:t>
+      </w:r>
+    </w:p>
+    <w:p>
+      <w:pPr>
+        <w:keepNext w:val="0"/>
+        <w:keepLines w:val="0"/>
+        <w:widowControl/>
+        <w:suppressLineNumbers w:val="0"/>
+        <w:shd w:val="clear" w:fill="1F1F1F"/>
+        <w:spacing w:line="143" w:lineRule="atLeast"/>
+        <w:jc w:val="left"/>
+        <w:rPr>
+          <w:rFonts w:hint="default" w:ascii="Consolas" w:hAnsi="Consolas" w:eastAsia="Consolas" w:cs="Consolas"/>
+          <w:b w:val="0"/>
+          <w:bCs w:val="0"/>
+          <w:color w:val="CCCCCC"/>
+          <w:sz w:val="21"/>
+          <w:szCs w:val="21"/>
+        </w:rPr>
+      </w:pPr>
+      <w:r>
+        <w:rPr>
+          <w:rFonts w:hint="default" w:ascii="Consolas" w:hAnsi="Consolas" w:eastAsia="Consolas" w:cs="Consolas"/>
+          <w:b w:val="0"/>
+          <w:bCs w:val="0"/>
+          <w:color w:val="CCCCCC"/>
+          <w:kern w:val="0"/>
+          <w:sz w:val="21"/>
+          <w:szCs w:val="21"/>
+          <w:shd w:val="clear" w:fill="1F1F1F"/>
+          <w:lang w:val="en-US" w:eastAsia="zh-CN" w:bidi="ar"/>
+        </w:rPr>
+        <w:t xml:space="preserve">            </w:t>
+      </w:r>
+      <w:r>
+        <w:rPr>
+          <w:rFonts w:hint="default" w:ascii="Consolas" w:hAnsi="Consolas" w:eastAsia="Consolas" w:cs="Consolas"/>
+          <w:b w:val="0"/>
+          <w:bCs w:val="0"/>
+          <w:color w:val="4EC9B0"/>
+          <w:kern w:val="0"/>
+          <w:sz w:val="21"/>
+          <w:szCs w:val="21"/>
+          <w:shd w:val="clear" w:fill="1F1F1F"/>
+          <w:lang w:val="en-US" w:eastAsia="zh-CN" w:bidi="ar"/>
+        </w:rPr>
+        <w:t>nn</w:t>
+      </w:r>
+      <w:r>
+        <w:rPr>
+          <w:rFonts w:hint="default" w:ascii="Consolas" w:hAnsi="Consolas" w:eastAsia="Consolas" w:cs="Consolas"/>
+          <w:b w:val="0"/>
+          <w:bCs w:val="0"/>
+          <w:color w:val="CCCCCC"/>
+          <w:kern w:val="0"/>
+          <w:sz w:val="21"/>
+          <w:szCs w:val="21"/>
+          <w:shd w:val="clear" w:fill="1F1F1F"/>
+          <w:lang w:val="en-US" w:eastAsia="zh-CN" w:bidi="ar"/>
+        </w:rPr>
+        <w:t>.</w:t>
+      </w:r>
+      <w:r>
+        <w:rPr>
+          <w:rFonts w:hint="default" w:ascii="Consolas" w:hAnsi="Consolas" w:eastAsia="Consolas" w:cs="Consolas"/>
+          <w:b w:val="0"/>
+          <w:bCs w:val="0"/>
+          <w:color w:val="4EC9B0"/>
+          <w:kern w:val="0"/>
+          <w:sz w:val="21"/>
+          <w:szCs w:val="21"/>
+          <w:shd w:val="clear" w:fill="1F1F1F"/>
+          <w:lang w:val="en-US" w:eastAsia="zh-CN" w:bidi="ar"/>
+        </w:rPr>
+        <w:t>ReLU</w:t>
+      </w:r>
+      <w:r>
+        <w:rPr>
+          <w:rFonts w:hint="default" w:ascii="Consolas" w:hAnsi="Consolas" w:eastAsia="Consolas" w:cs="Consolas"/>
+          <w:b w:val="0"/>
+          <w:bCs w:val="0"/>
+          <w:color w:val="CCCCCC"/>
+          <w:kern w:val="0"/>
+          <w:sz w:val="21"/>
+          <w:szCs w:val="21"/>
+          <w:shd w:val="clear" w:fill="1F1F1F"/>
+          <w:lang w:val="en-US" w:eastAsia="zh-CN" w:bidi="ar"/>
+        </w:rPr>
+        <w:t>(),</w:t>
+      </w:r>
+    </w:p>
+    <w:p>
+      <w:pPr>
+        <w:keepNext w:val="0"/>
+        <w:keepLines w:val="0"/>
+        <w:widowControl/>
+        <w:suppressLineNumbers w:val="0"/>
+        <w:shd w:val="clear" w:fill="1F1F1F"/>
+        <w:spacing w:line="143" w:lineRule="atLeast"/>
+        <w:jc w:val="left"/>
+        <w:rPr>
+          <w:rFonts w:hint="default" w:ascii="Consolas" w:hAnsi="Consolas" w:eastAsia="Consolas" w:cs="Consolas"/>
+          <w:b w:val="0"/>
+          <w:bCs w:val="0"/>
+          <w:color w:val="CCCCCC"/>
+          <w:sz w:val="21"/>
+          <w:szCs w:val="21"/>
+        </w:rPr>
+      </w:pPr>
+      <w:r>
+        <w:rPr>
+          <w:rFonts w:hint="default" w:ascii="Consolas" w:hAnsi="Consolas" w:eastAsia="Consolas" w:cs="Consolas"/>
+          <w:b w:val="0"/>
+          <w:bCs w:val="0"/>
+          <w:color w:val="CCCCCC"/>
+          <w:kern w:val="0"/>
+          <w:sz w:val="21"/>
+          <w:szCs w:val="21"/>
+          <w:shd w:val="clear" w:fill="1F1F1F"/>
+          <w:lang w:val="en-US" w:eastAsia="zh-CN" w:bidi="ar"/>
+        </w:rPr>
+        <w:t xml:space="preserve">            </w:t>
+      </w:r>
+      <w:r>
+        <w:rPr>
+          <w:rFonts w:hint="default" w:ascii="Consolas" w:hAnsi="Consolas" w:eastAsia="Consolas" w:cs="Consolas"/>
+          <w:b w:val="0"/>
+          <w:bCs w:val="0"/>
+          <w:color w:val="4EC9B0"/>
+          <w:kern w:val="0"/>
+          <w:sz w:val="21"/>
+          <w:szCs w:val="21"/>
+          <w:shd w:val="clear" w:fill="1F1F1F"/>
+          <w:lang w:val="en-US" w:eastAsia="zh-CN" w:bidi="ar"/>
+        </w:rPr>
+        <w:t>nn</w:t>
+      </w:r>
+      <w:r>
+        <w:rPr>
+          <w:rFonts w:hint="default" w:ascii="Consolas" w:hAnsi="Consolas" w:eastAsia="Consolas" w:cs="Consolas"/>
+          <w:b w:val="0"/>
+          <w:bCs w:val="0"/>
+          <w:color w:val="CCCCCC"/>
+          <w:kern w:val="0"/>
+          <w:sz w:val="21"/>
+          <w:szCs w:val="21"/>
+          <w:shd w:val="clear" w:fill="1F1F1F"/>
+          <w:lang w:val="en-US" w:eastAsia="zh-CN" w:bidi="ar"/>
+        </w:rPr>
+        <w:t>.</w:t>
+      </w:r>
+      <w:r>
+        <w:rPr>
+          <w:rFonts w:hint="default" w:ascii="Consolas" w:hAnsi="Consolas" w:eastAsia="Consolas" w:cs="Consolas"/>
+          <w:b w:val="0"/>
+          <w:bCs w:val="0"/>
+          <w:color w:val="4EC9B0"/>
+          <w:kern w:val="0"/>
+          <w:sz w:val="21"/>
+          <w:szCs w:val="21"/>
+          <w:shd w:val="clear" w:fill="1F1F1F"/>
+          <w:lang w:val="en-US" w:eastAsia="zh-CN" w:bidi="ar"/>
+        </w:rPr>
+        <w:t>Linear</w:t>
+      </w:r>
+      <w:r>
+        <w:rPr>
+          <w:rFonts w:hint="default" w:ascii="Consolas" w:hAnsi="Consolas" w:eastAsia="Consolas" w:cs="Consolas"/>
+          <w:b w:val="0"/>
+          <w:bCs w:val="0"/>
+          <w:color w:val="CCCCCC"/>
+          <w:kern w:val="0"/>
+          <w:sz w:val="21"/>
+          <w:szCs w:val="21"/>
+          <w:shd w:val="clear" w:fill="1F1F1F"/>
+          <w:lang w:val="en-US" w:eastAsia="zh-CN" w:bidi="ar"/>
+        </w:rPr>
+        <w:t>(</w:t>
+      </w:r>
+      <w:r>
+        <w:rPr>
+          <w:rFonts w:hint="default" w:ascii="Consolas" w:hAnsi="Consolas" w:eastAsia="Consolas" w:cs="Consolas"/>
+          <w:b w:val="0"/>
+          <w:bCs w:val="0"/>
+          <w:color w:val="B5CEA8"/>
+          <w:kern w:val="0"/>
+          <w:sz w:val="21"/>
+          <w:szCs w:val="21"/>
+          <w:shd w:val="clear" w:fill="1F1F1F"/>
+          <w:lang w:val="en-US" w:eastAsia="zh-CN" w:bidi="ar"/>
+        </w:rPr>
+        <w:t>128</w:t>
+      </w:r>
+      <w:r>
+        <w:rPr>
+          <w:rFonts w:hint="default" w:ascii="Consolas" w:hAnsi="Consolas" w:eastAsia="Consolas" w:cs="Consolas"/>
+          <w:b w:val="0"/>
+          <w:bCs w:val="0"/>
+          <w:color w:val="CCCCCC"/>
+          <w:kern w:val="0"/>
+          <w:sz w:val="21"/>
+          <w:szCs w:val="21"/>
+          <w:shd w:val="clear" w:fill="1F1F1F"/>
+          <w:lang w:val="en-US" w:eastAsia="zh-CN" w:bidi="ar"/>
+        </w:rPr>
+        <w:t xml:space="preserve">, </w:t>
+      </w:r>
+      <w:r>
+        <w:rPr>
+          <w:rFonts w:hint="default" w:ascii="Consolas" w:hAnsi="Consolas" w:eastAsia="Consolas" w:cs="Consolas"/>
+          <w:b w:val="0"/>
+          <w:bCs w:val="0"/>
+          <w:color w:val="B5CEA8"/>
+          <w:kern w:val="0"/>
+          <w:sz w:val="21"/>
+          <w:szCs w:val="21"/>
+          <w:shd w:val="clear" w:fill="1F1F1F"/>
+          <w:lang w:val="en-US" w:eastAsia="zh-CN" w:bidi="ar"/>
+        </w:rPr>
+        <w:t>256</w:t>
+      </w:r>
+      <w:r>
+        <w:rPr>
+          <w:rFonts w:hint="default" w:ascii="Consolas" w:hAnsi="Consolas" w:eastAsia="Consolas" w:cs="Consolas"/>
+          <w:b w:val="0"/>
+          <w:bCs w:val="0"/>
+          <w:color w:val="CCCCCC"/>
+          <w:kern w:val="0"/>
+          <w:sz w:val="21"/>
+          <w:szCs w:val="21"/>
+          <w:shd w:val="clear" w:fill="1F1F1F"/>
+          <w:lang w:val="en-US" w:eastAsia="zh-CN" w:bidi="ar"/>
+        </w:rPr>
+        <w:t>),</w:t>
+      </w:r>
+    </w:p>
+    <w:p>
+      <w:pPr>
+        <w:keepNext w:val="0"/>
+        <w:keepLines w:val="0"/>
+        <w:widowControl/>
+        <w:suppressLineNumbers w:val="0"/>
+        <w:shd w:val="clear" w:fill="1F1F1F"/>
+        <w:spacing w:line="143" w:lineRule="atLeast"/>
+        <w:jc w:val="left"/>
+        <w:rPr>
+          <w:rFonts w:hint="default" w:ascii="Consolas" w:hAnsi="Consolas" w:eastAsia="Consolas" w:cs="Consolas"/>
+          <w:b w:val="0"/>
+          <w:bCs w:val="0"/>
+          <w:color w:val="CCCCCC"/>
+          <w:sz w:val="21"/>
+          <w:szCs w:val="21"/>
+        </w:rPr>
+      </w:pPr>
+      <w:r>
+        <w:rPr>
+          <w:rFonts w:hint="default" w:ascii="Consolas" w:hAnsi="Consolas" w:eastAsia="Consolas" w:cs="Consolas"/>
+          <w:b w:val="0"/>
+          <w:bCs w:val="0"/>
+          <w:color w:val="CCCCCC"/>
+          <w:kern w:val="0"/>
+          <w:sz w:val="21"/>
+          <w:szCs w:val="21"/>
+          <w:shd w:val="clear" w:fill="1F1F1F"/>
+          <w:lang w:val="en-US" w:eastAsia="zh-CN" w:bidi="ar"/>
+        </w:rPr>
+        <w:t xml:space="preserve">            </w:t>
+      </w:r>
+      <w:r>
+        <w:rPr>
+          <w:rFonts w:hint="default" w:ascii="Consolas" w:hAnsi="Consolas" w:eastAsia="Consolas" w:cs="Consolas"/>
+          <w:b w:val="0"/>
+          <w:bCs w:val="0"/>
+          <w:color w:val="4EC9B0"/>
+          <w:kern w:val="0"/>
+          <w:sz w:val="21"/>
+          <w:szCs w:val="21"/>
+          <w:shd w:val="clear" w:fill="1F1F1F"/>
+          <w:lang w:val="en-US" w:eastAsia="zh-CN" w:bidi="ar"/>
+        </w:rPr>
+        <w:t>nn</w:t>
+      </w:r>
+      <w:r>
+        <w:rPr>
+          <w:rFonts w:hint="default" w:ascii="Consolas" w:hAnsi="Consolas" w:eastAsia="Consolas" w:cs="Consolas"/>
+          <w:b w:val="0"/>
+          <w:bCs w:val="0"/>
+          <w:color w:val="CCCCCC"/>
+          <w:kern w:val="0"/>
+          <w:sz w:val="21"/>
+          <w:szCs w:val="21"/>
+          <w:shd w:val="clear" w:fill="1F1F1F"/>
+          <w:lang w:val="en-US" w:eastAsia="zh-CN" w:bidi="ar"/>
+        </w:rPr>
+        <w:t>.</w:t>
+      </w:r>
+      <w:r>
+        <w:rPr>
+          <w:rFonts w:hint="default" w:ascii="Consolas" w:hAnsi="Consolas" w:eastAsia="Consolas" w:cs="Consolas"/>
+          <w:b w:val="0"/>
+          <w:bCs w:val="0"/>
+          <w:color w:val="4EC9B0"/>
+          <w:kern w:val="0"/>
+          <w:sz w:val="21"/>
+          <w:szCs w:val="21"/>
+          <w:shd w:val="clear" w:fill="1F1F1F"/>
+          <w:lang w:val="en-US" w:eastAsia="zh-CN" w:bidi="ar"/>
+        </w:rPr>
+        <w:t>ReLU</w:t>
+      </w:r>
+      <w:r>
+        <w:rPr>
+          <w:rFonts w:hint="default" w:ascii="Consolas" w:hAnsi="Consolas" w:eastAsia="Consolas" w:cs="Consolas"/>
+          <w:b w:val="0"/>
+          <w:bCs w:val="0"/>
+          <w:color w:val="CCCCCC"/>
+          <w:kern w:val="0"/>
+          <w:sz w:val="21"/>
+          <w:szCs w:val="21"/>
+          <w:shd w:val="clear" w:fill="1F1F1F"/>
+          <w:lang w:val="en-US" w:eastAsia="zh-CN" w:bidi="ar"/>
+        </w:rPr>
+        <w:t>(),</w:t>
+      </w:r>
+    </w:p>
+    <w:p>
+      <w:pPr>
+        <w:keepNext w:val="0"/>
+        <w:keepLines w:val="0"/>
+        <w:widowControl/>
+        <w:suppressLineNumbers w:val="0"/>
+        <w:shd w:val="clear" w:fill="1F1F1F"/>
+        <w:spacing w:line="143" w:lineRule="atLeast"/>
+        <w:jc w:val="left"/>
+        <w:rPr>
+          <w:rFonts w:hint="default" w:ascii="Consolas" w:hAnsi="Consolas" w:eastAsia="Consolas" w:cs="Consolas"/>
+          <w:b w:val="0"/>
+          <w:bCs w:val="0"/>
+          <w:color w:val="CCCCCC"/>
+          <w:sz w:val="21"/>
+          <w:szCs w:val="21"/>
+        </w:rPr>
+      </w:pPr>
+      <w:r>
+        <w:rPr>
+          <w:rFonts w:hint="default" w:ascii="Consolas" w:hAnsi="Consolas" w:eastAsia="Consolas" w:cs="Consolas"/>
+          <w:b w:val="0"/>
+          <w:bCs w:val="0"/>
+          <w:color w:val="CCCCCC"/>
+          <w:kern w:val="0"/>
+          <w:sz w:val="21"/>
+          <w:szCs w:val="21"/>
+          <w:shd w:val="clear" w:fill="1F1F1F"/>
+          <w:lang w:val="en-US" w:eastAsia="zh-CN" w:bidi="ar"/>
+        </w:rPr>
+        <w:t xml:space="preserve">            </w:t>
+      </w:r>
+      <w:r>
+        <w:rPr>
+          <w:rFonts w:hint="default" w:ascii="Consolas" w:hAnsi="Consolas" w:eastAsia="Consolas" w:cs="Consolas"/>
+          <w:b w:val="0"/>
+          <w:bCs w:val="0"/>
+          <w:color w:val="4EC9B0"/>
+          <w:kern w:val="0"/>
+          <w:sz w:val="21"/>
+          <w:szCs w:val="21"/>
+          <w:shd w:val="clear" w:fill="1F1F1F"/>
+          <w:lang w:val="en-US" w:eastAsia="zh-CN" w:bidi="ar"/>
+        </w:rPr>
+        <w:t>nn</w:t>
+      </w:r>
+      <w:r>
+        <w:rPr>
+          <w:rFonts w:hint="default" w:ascii="Consolas" w:hAnsi="Consolas" w:eastAsia="Consolas" w:cs="Consolas"/>
+          <w:b w:val="0"/>
+          <w:bCs w:val="0"/>
+          <w:color w:val="CCCCCC"/>
+          <w:kern w:val="0"/>
+          <w:sz w:val="21"/>
+          <w:szCs w:val="21"/>
+          <w:shd w:val="clear" w:fill="1F1F1F"/>
+          <w:lang w:val="en-US" w:eastAsia="zh-CN" w:bidi="ar"/>
+        </w:rPr>
+        <w:t>.</w:t>
+      </w:r>
+      <w:r>
+        <w:rPr>
+          <w:rFonts w:hint="default" w:ascii="Consolas" w:hAnsi="Consolas" w:eastAsia="Consolas" w:cs="Consolas"/>
+          <w:b w:val="0"/>
+          <w:bCs w:val="0"/>
+          <w:color w:val="4EC9B0"/>
+          <w:kern w:val="0"/>
+          <w:sz w:val="21"/>
+          <w:szCs w:val="21"/>
+          <w:shd w:val="clear" w:fill="1F1F1F"/>
+          <w:lang w:val="en-US" w:eastAsia="zh-CN" w:bidi="ar"/>
+        </w:rPr>
+        <w:t>Linear</w:t>
+      </w:r>
+      <w:r>
+        <w:rPr>
+          <w:rFonts w:hint="default" w:ascii="Consolas" w:hAnsi="Consolas" w:eastAsia="Consolas" w:cs="Consolas"/>
+          <w:b w:val="0"/>
+          <w:bCs w:val="0"/>
+          <w:color w:val="CCCCCC"/>
+          <w:kern w:val="0"/>
+          <w:sz w:val="21"/>
+          <w:szCs w:val="21"/>
+          <w:shd w:val="clear" w:fill="1F1F1F"/>
+          <w:lang w:val="en-US" w:eastAsia="zh-CN" w:bidi="ar"/>
+        </w:rPr>
+        <w:t>(</w:t>
+      </w:r>
+      <w:r>
+        <w:rPr>
+          <w:rFonts w:hint="default" w:ascii="Consolas" w:hAnsi="Consolas" w:eastAsia="Consolas" w:cs="Consolas"/>
+          <w:b w:val="0"/>
+          <w:bCs w:val="0"/>
+          <w:color w:val="B5CEA8"/>
+          <w:kern w:val="0"/>
+          <w:sz w:val="21"/>
+          <w:szCs w:val="21"/>
+          <w:shd w:val="clear" w:fill="1F1F1F"/>
+          <w:lang w:val="en-US" w:eastAsia="zh-CN" w:bidi="ar"/>
+        </w:rPr>
+        <w:t>256</w:t>
+      </w:r>
+      <w:r>
+        <w:rPr>
+          <w:rFonts w:hint="default" w:ascii="Consolas" w:hAnsi="Consolas" w:eastAsia="Consolas" w:cs="Consolas"/>
+          <w:b w:val="0"/>
+          <w:bCs w:val="0"/>
+          <w:color w:val="CCCCCC"/>
+          <w:kern w:val="0"/>
+          <w:sz w:val="21"/>
+          <w:szCs w:val="21"/>
+          <w:shd w:val="clear" w:fill="1F1F1F"/>
+          <w:lang w:val="en-US" w:eastAsia="zh-CN" w:bidi="ar"/>
+        </w:rPr>
+        <w:t xml:space="preserve">, </w:t>
+      </w:r>
+      <w:r>
+        <w:rPr>
+          <w:rFonts w:hint="default" w:ascii="Consolas" w:hAnsi="Consolas" w:eastAsia="Consolas" w:cs="Consolas"/>
+          <w:b w:val="0"/>
+          <w:bCs w:val="0"/>
+          <w:color w:val="9CDCFE"/>
+          <w:kern w:val="0"/>
+          <w:sz w:val="21"/>
+          <w:szCs w:val="21"/>
+          <w:shd w:val="clear" w:fill="1F1F1F"/>
+          <w:lang w:val="en-US" w:eastAsia="zh-CN" w:bidi="ar"/>
+        </w:rPr>
+        <w:t>input_dim</w:t>
+      </w:r>
+      <w:r>
+        <w:rPr>
+          <w:rFonts w:hint="default" w:ascii="Consolas" w:hAnsi="Consolas" w:eastAsia="Consolas" w:cs="Consolas"/>
+          <w:b w:val="0"/>
+          <w:bCs w:val="0"/>
+          <w:color w:val="CCCCCC"/>
+          <w:kern w:val="0"/>
+          <w:sz w:val="21"/>
+          <w:szCs w:val="21"/>
+          <w:shd w:val="clear" w:fill="1F1F1F"/>
+          <w:lang w:val="en-US" w:eastAsia="zh-CN" w:bidi="ar"/>
+        </w:rPr>
+        <w:t>),</w:t>
+      </w:r>
+    </w:p>
+    <w:p>
+      <w:pPr>
+        <w:keepNext w:val="0"/>
+        <w:keepLines w:val="0"/>
+        <w:widowControl/>
+        <w:suppressLineNumbers w:val="0"/>
+        <w:shd w:val="clear" w:fill="1F1F1F"/>
+        <w:spacing w:line="143" w:lineRule="atLeast"/>
+        <w:jc w:val="left"/>
+        <w:rPr>
+          <w:rFonts w:hint="default" w:ascii="Consolas" w:hAnsi="Consolas" w:eastAsia="Consolas" w:cs="Consolas"/>
+          <w:b w:val="0"/>
+          <w:bCs w:val="0"/>
+          <w:color w:val="CCCCCC"/>
+          <w:sz w:val="21"/>
+          <w:szCs w:val="21"/>
+        </w:rPr>
+      </w:pPr>
+      <w:r>
+        <w:rPr>
+          <w:rFonts w:hint="default" w:ascii="Consolas" w:hAnsi="Consolas" w:eastAsia="Consolas" w:cs="Consolas"/>
+          <w:b w:val="0"/>
+          <w:bCs w:val="0"/>
+          <w:color w:val="CCCCCC"/>
+          <w:kern w:val="0"/>
+          <w:sz w:val="21"/>
+          <w:szCs w:val="21"/>
+          <w:shd w:val="clear" w:fill="1F1F1F"/>
+          <w:lang w:val="en-US" w:eastAsia="zh-CN" w:bidi="ar"/>
+        </w:rPr>
+        <w:t>        )</w:t>
+      </w:r>
+    </w:p>
+    <w:p>
+      <w:pPr>
+        <w:widowControl w:val="0"/>
+        <w:numPr>
+          <w:numId w:val="0"/>
+        </w:numPr>
+        <w:jc w:val="both"/>
+        <w:rPr>
+          <w:rFonts w:hint="default"/>
+          <w:lang w:val="en-US" w:eastAsia="zh-CN"/>
+        </w:rPr>
+      </w:pPr>
+      <w:r>
+        <w:rPr>
+          <w:rFonts w:hint="default"/>
+          <w:b w:val="0"/>
+          <w:bCs w:val="0"/>
+          <w:lang w:val="en-US" w:eastAsia="zh-CN"/>
+        </w:rPr>
+        <w:br w:type="textWrapping"/>
+      </w:r>
+      <w:r>
+        <w:rPr>
+          <w:rFonts w:hint="eastAsia"/>
+          <w:b/>
+          <w:bCs/>
+          <w:lang w:val="en-US" w:eastAsia="zh-CN"/>
+        </w:rPr>
+        <w:t>方案2：做了一个只有一部分数据的</w:t>
+      </w:r>
+    </w:p>
+    <w:p>
+      <w:pPr>
+        <w:widowControl w:val="0"/>
+        <w:numPr>
+          <w:numId w:val="0"/>
+        </w:numPr>
+        <w:jc w:val="both"/>
+        <w:rPr>
+          <w:rFonts w:hint="default"/>
+          <w:b w:val="0"/>
+          <w:bCs w:val="0"/>
+          <w:lang w:val="en-US" w:eastAsia="zh-CN"/>
+        </w:rPr>
+      </w:pPr>
+    </w:p>
+    <w:p>
+      <w:pPr>
+        <w:bidi w:val="0"/>
+        <w:rPr>
+          <w:rFonts w:hint="eastAsia" w:cstheme="minorBidi"/>
+          <w:kern w:val="2"/>
+          <w:sz w:val="21"/>
+          <w:szCs w:val="24"/>
+          <w:lang w:val="en-US" w:eastAsia="zh-CN" w:bidi="ar-SA"/>
+        </w:rPr>
+      </w:pPr>
+      <w:r>
+        <w:rPr>
+          <w:rFonts w:hint="eastAsia" w:cstheme="minorBidi"/>
+          <w:kern w:val="2"/>
+          <w:sz w:val="21"/>
+          <w:szCs w:val="24"/>
+          <w:lang w:val="en-US" w:eastAsia="zh-CN" w:bidi="ar-SA"/>
+        </w:rPr>
+        <w:t>使用的第二个方案原理是这样的：</w:t>
+      </w:r>
+    </w:p>
+    <w:p>
+      <w:pPr>
+        <w:bidi w:val="0"/>
+        <w:rPr>
+          <w:rFonts w:hint="default" w:cstheme="minorBidi"/>
+          <w:kern w:val="2"/>
+          <w:sz w:val="21"/>
+          <w:szCs w:val="24"/>
+          <w:lang w:val="en-US" w:eastAsia="zh-CN" w:bidi="ar-SA"/>
+        </w:rPr>
+      </w:pPr>
+      <w:r>
+        <w:rPr>
+          <w:rFonts w:hint="eastAsia" w:cstheme="minorBidi"/>
+          <w:kern w:val="2"/>
+          <w:sz w:val="21"/>
+          <w:szCs w:val="24"/>
+          <w:lang w:val="en-US" w:eastAsia="zh-CN" w:bidi="ar-SA"/>
+        </w:rPr>
+        <w:t>先将表格数据转化成文本数据，用文本编码器（目前使用的是非深度学习的文本编码方式</w:t>
+      </w:r>
+      <w:r>
+        <w:rPr>
+          <w:rFonts w:ascii="宋体" w:hAnsi="宋体" w:eastAsia="宋体" w:cs="宋体"/>
+          <w:sz w:val="24"/>
+          <w:szCs w:val="24"/>
+        </w:rPr>
+        <w:t>TfidfVectorizer</w:t>
+      </w:r>
+      <w:r>
+        <w:rPr>
+          <w:rFonts w:hint="eastAsia" w:cstheme="minorBidi"/>
+          <w:kern w:val="2"/>
+          <w:sz w:val="21"/>
+          <w:szCs w:val="24"/>
+          <w:lang w:val="en-US" w:eastAsia="zh-CN" w:bidi="ar-SA"/>
+        </w:rPr>
+        <w:t>）学习压缩到64为向量，再使用正常的MLP压缩到64维，进行对比学习，看一下聚类情况。（目前制作了一个很少数据的轻量版的，还没有做一个全面的实验）</w:t>
+      </w:r>
+      <w:r>
+        <w:rPr>
+          <w:rFonts w:hint="eastAsia" w:cstheme="minorBidi"/>
+          <w:kern w:val="2"/>
+          <w:sz w:val="21"/>
+          <w:szCs w:val="24"/>
+          <w:lang w:val="en-US" w:eastAsia="zh-CN" w:bidi="ar-SA"/>
+        </w:rPr>
+        <w:br w:type="textWrapping"/>
+      </w:r>
+      <w:r>
+        <w:rPr>
+          <w:rFonts w:hint="eastAsia" w:cstheme="minorBidi"/>
+          <w:kern w:val="2"/>
+          <w:sz w:val="21"/>
+          <w:szCs w:val="24"/>
+          <w:lang w:val="en-US" w:eastAsia="zh-CN" w:bidi="ar-SA"/>
+        </w:rPr>
+        <w:t>这个是一个表格转化出来的文本的例子：</w:t>
+      </w:r>
+    </w:p>
+    <w:p>
+      <w:pPr>
+        <w:bidi w:val="0"/>
+        <w:rPr>
+          <w:rFonts w:hint="default" w:eastAsia="宋体" w:cstheme="minorBidi"/>
+          <w:kern w:val="2"/>
+          <w:sz w:val="21"/>
+          <w:szCs w:val="24"/>
+          <w:lang w:val="en-US" w:eastAsia="zh-CN" w:bidi="ar-SA"/>
+        </w:rPr>
+      </w:pPr>
+      <w:r>
+        <w:rPr>
+          <w:rFonts w:hint="default" w:cstheme="minorBidi"/>
+          <w:kern w:val="2"/>
+          <w:sz w:val="21"/>
+          <w:szCs w:val="24"/>
+          <w:lang w:val="en-US" w:eastAsia="zh-CN" w:bidi="ar-SA"/>
+        </w:rPr>
+        <w:t>7,样本编号7。 74岁。 性别男。 婚姻状况1。 文化程度初中。 市南京市。 患有慢性病数量0。 服用药物数量0。 过去一年住院次数0。 过去一年急诊次数0。 是否高血压0。 是否糖尿病0。 是否骨质疏松0。 是否脑血栓0。 是否焦虑抑郁症0。 听力障碍无。 视力障碍无。 活力-BMI值23.44。 认知-总分28。 心理-总分1。 活力-总分14。 运动-总分12。 生活行为与社会功能评估-总分3。</w:t>
+      </w:r>
+      <w:r>
+        <w:rPr>
+          <w:rFonts w:hint="default" w:cstheme="minorBidi"/>
+          <w:kern w:val="2"/>
+          <w:sz w:val="21"/>
+          <w:szCs w:val="24"/>
+          <w:lang w:val="en-US" w:eastAsia="zh-CN" w:bidi="ar-SA"/>
+        </w:rPr>
+        <w:br w:type="textWrapping"/>
+      </w:r>
+      <w:r>
+        <w:rPr>
+          <w:rFonts w:hint="default" w:cstheme="minorBidi"/>
+          <w:kern w:val="2"/>
+          <w:sz w:val="21"/>
+          <w:szCs w:val="24"/>
+          <w:lang w:val="en-US" w:eastAsia="zh-CN" w:bidi="ar-SA"/>
+        </w:rPr>
+        <w:br w:type="textWrapping"/>
+      </w:r>
+      <w:r>
+        <w:rPr>
+          <w:rFonts w:hint="eastAsia" w:cstheme="minorBidi"/>
+          <w:kern w:val="2"/>
+          <w:sz w:val="21"/>
+          <w:szCs w:val="24"/>
+          <w:lang w:val="en-US" w:eastAsia="zh-CN" w:bidi="ar-SA"/>
+        </w:rPr>
+        <w:t>这个轻量型的实验目前的聚类的效果不够强，可以把它当成一个分支来做，目前只是证明了这个方案可行，但是还没有进行大规模的实验。</w:t>
+      </w:r>
+      <w:r>
+        <w:rPr>
+          <w:rFonts w:hint="eastAsia" w:cstheme="minorBidi"/>
+          <w:kern w:val="2"/>
+          <w:sz w:val="21"/>
+          <w:szCs w:val="24"/>
+          <w:lang w:val="en-US" w:eastAsia="zh-CN" w:bidi="ar-SA"/>
+        </w:rPr>
+        <w:br w:type="textWrapping"/>
+      </w:r>
+      <w:r>
+        <w:rPr>
+          <w:rFonts w:hint="eastAsia" w:cstheme="minorBidi"/>
+          <w:kern w:val="2"/>
+          <w:sz w:val="21"/>
+          <w:szCs w:val="24"/>
+          <w:lang w:val="en-US" w:eastAsia="zh-CN" w:bidi="ar-SA"/>
+        </w:rPr>
+        <w:t>目前这个轻量型实验的局限在于：知识将表格数据换一种几乎完全相同的表达方式，</w:t>
+      </w:r>
+      <w:r>
+        <w:rPr>
+          <w:rFonts w:ascii="宋体" w:hAnsi="宋体" w:eastAsia="宋体" w:cs="宋体"/>
+          <w:sz w:val="24"/>
+          <w:szCs w:val="24"/>
+        </w:rPr>
+        <w:t>字段间复杂关系没有真正被自然语言重组</w:t>
+      </w:r>
+    </w:p>
+    <w:p>
+      <w:pPr>
+        <w:rPr>
+          <w:rFonts w:hint="default"/>
+          <w:lang w:val="en-US" w:eastAsia="zh-CN"/>
+        </w:rPr>
+      </w:pPr>
+      <w:r>
+        <w:rPr>
+          <w:rFonts w:hint="default"/>
+          <w:lang w:val="en-US" w:eastAsia="zh-CN"/>
+        </w:rPr>
+        <w:br w:type="page"/>
+      </w:r>
+    </w:p>
+    <w:p>
+      <w:pPr>
+        <w:bidi w:val="0"/>
+        <w:rPr>
+          <w:rFonts w:hint="eastAsia" w:cstheme="minorBidi"/>
+          <w:kern w:val="2"/>
+          <w:sz w:val="21"/>
+          <w:szCs w:val="24"/>
+          <w:lang w:val="en-US" w:eastAsia="zh-CN" w:bidi="ar-SA"/>
+        </w:rPr>
+      </w:pPr>
       <w:bookmarkStart w:id="0" w:name="_GoBack"/>
-      <w:bookmarkEnd w:id="0"/>
-    </w:p>
+      <w:r>
+        <w:rPr>
+          <w:rFonts w:hint="eastAsia" w:cstheme="minorBidi"/>
+          <w:kern w:val="2"/>
+          <w:sz w:val="21"/>
+          <w:szCs w:val="24"/>
+          <w:lang w:val="en-US" w:eastAsia="zh-CN" w:bidi="ar-SA"/>
+        </w:rPr>
+        <w:t>这两个方案的对应的改进方向：</w:t>
+      </w:r>
+    </w:p>
+    <w:p>
+      <w:pPr>
+        <w:bidi w:val="0"/>
+        <w:rPr>
+          <w:rFonts w:hint="default"/>
+          <w:lang w:val="en-US" w:eastAsia="zh-CN"/>
+        </w:rPr>
+      </w:pPr>
+      <w:r>
+        <w:rPr>
+          <w:rFonts w:hint="eastAsia" w:cstheme="minorBidi"/>
+          <w:kern w:val="2"/>
+          <w:sz w:val="21"/>
+          <w:szCs w:val="24"/>
+          <w:lang w:val="en-US" w:eastAsia="zh-CN" w:bidi="ar-SA"/>
+        </w:rPr>
+        <w:t>A：把MLP升级成更加符合表格数据的FT-Transformer/SAINT；在得到超越PCA的更好地聚类结果之后进行①关联性解释、②伪时序（比如在压缩的32维空间中，能找到IC高的中心和IC低的中心，那么一个样本的32维的向量，就可以用两中心之间的距离来表示他目前的健康状况的连续变化方向）、③反事实分析（</w:t>
+      </w:r>
+      <w:r>
+        <w:rPr>
+          <w:rFonts w:hint="default" w:cstheme="minorBidi"/>
+          <w:kern w:val="2"/>
+          <w:sz w:val="21"/>
+          <w:szCs w:val="24"/>
+          <w:lang w:val="en-US" w:eastAsia="zh-CN" w:bidi="ar-SA"/>
+        </w:rPr>
+        <w:t>如果这个样本不是现在这个坏状态，而是更接近一个更好的状态，那通常要往哪些变量方向变化</w:t>
+      </w:r>
+      <w:r>
+        <w:rPr>
+          <w:rFonts w:hint="eastAsia"/>
+          <w:lang w:val="en-US" w:eastAsia="zh-CN"/>
+        </w:rPr>
+        <w:t>）</w:t>
+      </w:r>
+      <w:r>
+        <w:rPr>
+          <w:rFonts w:hint="eastAsia"/>
+          <w:lang w:val="en-US" w:eastAsia="zh-CN"/>
+        </w:rPr>
+        <w:br w:type="textWrapping"/>
+      </w:r>
+    </w:p>
+    <w:p>
+      <w:pPr>
+        <w:bidi w:val="0"/>
+        <w:jc w:val="left"/>
+        <w:rPr>
+          <w:rFonts w:hint="eastAsia"/>
+          <w:lang w:val="en-US" w:eastAsia="zh-CN"/>
+        </w:rPr>
+      </w:pPr>
+      <w:r>
+        <w:rPr>
+          <w:rFonts w:hint="eastAsia"/>
+          <w:lang w:val="en-US" w:eastAsia="zh-CN"/>
+        </w:rPr>
+        <w:t>B：把tab2text使用LLM来做，使用BERT做文本编码器，把所有的数据都是用上进行文本和表格数据的对齐</w:t>
+      </w:r>
+    </w:p>
+    <w:p>
+      <w:pPr>
+        <w:bidi w:val="0"/>
+        <w:jc w:val="left"/>
+        <w:rPr>
+          <w:rFonts w:hint="eastAsia"/>
+          <w:lang w:val="en-US" w:eastAsia="zh-CN"/>
+        </w:rPr>
+      </w:pPr>
+    </w:p>
+    <w:p>
+      <w:pPr>
+        <w:bidi w:val="0"/>
+        <w:jc w:val="left"/>
+        <w:rPr>
+          <w:rFonts w:hint="eastAsia"/>
+          <w:lang w:val="en-US" w:eastAsia="zh-CN"/>
+        </w:rPr>
+      </w:pPr>
+      <w:r>
+        <w:rPr>
+          <w:rFonts w:hint="eastAsia"/>
+          <w:lang w:val="en-US" w:eastAsia="zh-CN"/>
+        </w:rPr>
+        <w:t>LLM的用武之地：</w:t>
+      </w:r>
+    </w:p>
+    <w:p>
+      <w:pPr>
+        <w:bidi w:val="0"/>
+        <w:jc w:val="left"/>
+        <w:rPr>
+          <w:rFonts w:hint="eastAsia"/>
+          <w:lang w:val="en-US" w:eastAsia="zh-CN"/>
+        </w:rPr>
+      </w:pPr>
+      <w:r>
+        <w:rPr>
+          <w:rFonts w:hint="eastAsia"/>
+          <w:lang w:val="en-US" w:eastAsia="zh-CN"/>
+        </w:rPr>
+        <w:t>tab2text</w:t>
+      </w:r>
+    </w:p>
+    <w:p>
+      <w:pPr>
+        <w:bidi w:val="0"/>
+        <w:jc w:val="left"/>
+        <w:rPr>
+          <w:rFonts w:hint="eastAsia"/>
+          <w:lang w:val="en-US" w:eastAsia="zh-CN"/>
+        </w:rPr>
+      </w:pPr>
+      <w:r>
+        <w:rPr>
+          <w:rFonts w:hint="eastAsia"/>
+          <w:lang w:val="en-US" w:eastAsia="zh-CN"/>
+        </w:rPr>
+        <w:t>亚型命名</w:t>
+      </w:r>
+    </w:p>
+    <w:p>
+      <w:pPr>
+        <w:bidi w:val="0"/>
+        <w:jc w:val="left"/>
+        <w:rPr>
+          <w:rFonts w:hint="default"/>
+          <w:lang w:val="en-US" w:eastAsia="zh-CN"/>
+        </w:rPr>
+      </w:pPr>
+      <w:r>
+        <w:rPr>
+          <w:rFonts w:hint="eastAsia"/>
+          <w:lang w:val="en-US" w:eastAsia="zh-CN"/>
+        </w:rPr>
+        <w:t>病例的临床报告</w:t>
+      </w:r>
+    </w:p>
+    <w:bookmarkEnd w:id="0"/>
     <w:sectPr>
       <w:pgSz w:w="11906" w:h="16838"/>
       <w:pgMar w:top="1440" w:right="1800" w:bottom="1440" w:left="1800" w:header="851" w:footer="992" w:gutter="0"/>
@@ -6143,6 +8452,18 @@
     </w:lvl>
   </w:abstractNum>
   <w:abstractNum w:abstractNumId="2">
+    <w:nsid w:val="A80D3CB7"/>
+    <w:multiLevelType w:val="singleLevel"/>
+    <w:tmpl w:val="A80D3CB7"/>
+    <w:lvl w:ilvl="0" w:tentative="0">
+      <w:start w:val="1"/>
+      <w:numFmt w:val="decimal"/>
+      <w:suff w:val="nothing"/>
+      <w:lvlText w:val="%1、"/>
+      <w:lvlJc w:val="left"/>
+    </w:lvl>
+  </w:abstractNum>
+  <w:abstractNum w:abstractNumId="3">
     <w:nsid w:val="B9E27244"/>
     <w:multiLevelType w:val="singleLevel"/>
     <w:tmpl w:val="B9E27244"/>
@@ -6158,7 +8479,7 @@
       </w:pPr>
     </w:lvl>
   </w:abstractNum>
-  <w:abstractNum w:abstractNumId="3">
+  <w:abstractNum w:abstractNumId="4">
     <w:nsid w:val="BE941963"/>
     <w:multiLevelType w:val="singleLevel"/>
     <w:tmpl w:val="BE941963"/>
@@ -6170,7 +8491,7 @@
       <w:lvlJc w:val="left"/>
     </w:lvl>
   </w:abstractNum>
-  <w:abstractNum w:abstractNumId="4">
+  <w:abstractNum w:abstractNumId="5">
     <w:nsid w:val="CD349525"/>
     <w:multiLevelType w:val="singleLevel"/>
     <w:tmpl w:val="CD349525"/>
@@ -6182,7 +8503,7 @@
       <w:lvlJc w:val="left"/>
     </w:lvl>
   </w:abstractNum>
-  <w:abstractNum w:abstractNumId="5">
+  <w:abstractNum w:abstractNumId="6">
     <w:nsid w:val="CFA14274"/>
     <w:multiLevelType w:val="singleLevel"/>
     <w:tmpl w:val="CFA14274"/>
@@ -6194,7 +8515,7 @@
       <w:lvlJc w:val="left"/>
     </w:lvl>
   </w:abstractNum>
-  <w:abstractNum w:abstractNumId="6">
+  <w:abstractNum w:abstractNumId="7">
     <w:nsid w:val="D7E87AEC"/>
     <w:multiLevelType w:val="singleLevel"/>
     <w:tmpl w:val="D7E87AEC"/>
@@ -6206,7 +8527,7 @@
       <w:lvlJc w:val="left"/>
     </w:lvl>
   </w:abstractNum>
-  <w:abstractNum w:abstractNumId="7">
+  <w:abstractNum w:abstractNumId="8">
     <w:nsid w:val="E97E1A69"/>
     <w:multiLevelType w:val="singleLevel"/>
     <w:tmpl w:val="E97E1A69"/>
@@ -6218,7 +8539,7 @@
       <w:lvlJc w:val="left"/>
     </w:lvl>
   </w:abstractNum>
-  <w:abstractNum w:abstractNumId="8">
+  <w:abstractNum w:abstractNumId="9">
     <w:nsid w:val="EBC5E103"/>
     <w:multiLevelType w:val="singleLevel"/>
     <w:tmpl w:val="EBC5E103"/>
@@ -6230,7 +8551,7 @@
       <w:lvlJc w:val="left"/>
     </w:lvl>
   </w:abstractNum>
-  <w:abstractNum w:abstractNumId="9">
+  <w:abstractNum w:abstractNumId="10">
     <w:nsid w:val="02E84666"/>
     <w:multiLevelType w:val="singleLevel"/>
     <w:tmpl w:val="02E84666"/>
@@ -6242,7 +8563,7 @@
       <w:lvlJc w:val="left"/>
     </w:lvl>
   </w:abstractNum>
-  <w:abstractNum w:abstractNumId="10">
+  <w:abstractNum w:abstractNumId="11">
     <w:nsid w:val="2EF79F7D"/>
     <w:multiLevelType w:val="singleLevel"/>
     <w:tmpl w:val="2EF79F7D"/>
@@ -6254,7 +8575,7 @@
       <w:lvlJc w:val="left"/>
     </w:lvl>
   </w:abstractNum>
-  <w:abstractNum w:abstractNumId="11">
+  <w:abstractNum w:abstractNumId="12">
     <w:nsid w:val="578FB10B"/>
     <w:multiLevelType w:val="singleLevel"/>
     <w:tmpl w:val="578FB10B"/>
@@ -6270,7 +8591,7 @@
       </w:pPr>
     </w:lvl>
   </w:abstractNum>
-  <w:abstractNum w:abstractNumId="12">
+  <w:abstractNum w:abstractNumId="13">
     <w:nsid w:val="79413F56"/>
     <w:multiLevelType w:val="singleLevel"/>
     <w:tmpl w:val="79413F56"/>
@@ -6286,43 +8607,46 @@
     </w:lvl>
   </w:abstractNum>
   <w:num w:numId="1">
-    <w:abstractNumId w:val="7"/>
+    <w:abstractNumId w:val="8"/>
   </w:num>
   <w:num w:numId="2">
-    <w:abstractNumId w:val="8"/>
+    <w:abstractNumId w:val="9"/>
   </w:num>
   <w:num w:numId="3">
-    <w:abstractNumId w:val="3"/>
+    <w:abstractNumId w:val="4"/>
   </w:num>
   <w:num w:numId="4">
-    <w:abstractNumId w:val="4"/>
+    <w:abstractNumId w:val="5"/>
   </w:num>
   <w:num w:numId="5">
-    <w:abstractNumId w:val="9"/>
+    <w:abstractNumId w:val="10"/>
   </w:num>
   <w:num w:numId="6">
-    <w:abstractNumId w:val="10"/>
+    <w:abstractNumId w:val="11"/>
   </w:num>
   <w:num w:numId="7">
-    <w:abstractNumId w:val="12"/>
+    <w:abstractNumId w:val="13"/>
   </w:num>
   <w:num w:numId="8">
     <w:abstractNumId w:val="0"/>
   </w:num>
   <w:num w:numId="9">
-    <w:abstractNumId w:val="2"/>
+    <w:abstractNumId w:val="3"/>
   </w:num>
   <w:num w:numId="10">
-    <w:abstractNumId w:val="11"/>
+    <w:abstractNumId w:val="12"/>
   </w:num>
   <w:num w:numId="11">
     <w:abstractNumId w:val="1"/>
   </w:num>
   <w:num w:numId="12">
+    <w:abstractNumId w:val="7"/>
+  </w:num>
+  <w:num w:numId="13">
     <w:abstractNumId w:val="6"/>
   </w:num>
-  <w:num w:numId="13">
-    <w:abstractNumId w:val="5"/>
+  <w:num w:numId="14">
+    <w:abstractNumId w:val="2"/>
   </w:num>
 </w:numbering>
 </file>

</xml_diff>